<commit_message>
New improving of my CFBD  with rewriting some scrapers in order to respect our methodology starting by jsonfile -> load ->scraping ->parse . We should not forget that now we can not load data straight from CFDB by this month.
</commit_message>
<xml_diff>
--- a/Data Engineering Project GeorgiaGames.docx
+++ b/Data Engineering Project GeorgiaGames.docx
@@ -789,10 +789,10 @@
           <w:szCs w:val="24"/>
         </w:rPr>
         <w:object w:dxaOrig="1520" w:dyaOrig="987" w14:anchorId="61754E30">
-          <v:shape id="_x0000_i1025" type="#_x0000_t75" style="width:83.4pt;height:60pt" o:ole="">
+          <v:shape id="_x0000_i1027" type="#_x0000_t75" style="width:83.5pt;height:60pt" o:ole="">
             <v:imagedata r:id="rId6" o:title=""/>
           </v:shape>
-          <o:OLEObject Type="Embed" ProgID="Excel.Sheet.12" ShapeID="_x0000_i1025" DrawAspect="Icon" ObjectID="_1838112048" r:id="rId7"/>
+          <o:OLEObject Type="Embed" ProgID="Excel.Sheet.12" ShapeID="_x0000_i1027" DrawAspect="Icon" ObjectID="_1838833835" r:id="rId7"/>
         </w:object>
       </w:r>
     </w:p>
@@ -5367,10 +5367,10 @@
           <w:szCs w:val="24"/>
         </w:rPr>
         <w:object w:dxaOrig="1520" w:dyaOrig="987" w14:anchorId="32EE9A1C">
-          <v:shape id="_x0000_i1026" type="#_x0000_t75" style="width:76.2pt;height:49.2pt" o:ole="">
+          <v:shape id="_x0000_i1028" type="#_x0000_t75" style="width:76pt;height:49pt" o:ole="">
             <v:imagedata r:id="rId10" o:title=""/>
           </v:shape>
-          <o:OLEObject Type="Embed" ProgID="Excel.Sheet.12" ShapeID="_x0000_i1026" DrawAspect="Icon" ObjectID="_1838112049" r:id="rId11"/>
+          <o:OLEObject Type="Embed" ProgID="Excel.Sheet.12" ShapeID="_x0000_i1028" DrawAspect="Icon" ObjectID="_1838833836" r:id="rId11"/>
         </w:object>
       </w:r>
     </w:p>
@@ -6790,10 +6790,10 @@
       </w:r>
       <w:r>
         <w:object w:dxaOrig="1520" w:dyaOrig="987" w14:anchorId="7B8F0B97">
-          <v:shape id="_x0000_i1027" type="#_x0000_t75" style="width:76.2pt;height:49.2pt" o:ole="">
+          <v:shape id="_x0000_i1029" type="#_x0000_t75" style="width:76pt;height:49pt" o:ole="">
             <v:imagedata r:id="rId12" o:title=""/>
           </v:shape>
-          <o:OLEObject Type="Embed" ProgID="Package" ShapeID="_x0000_i1027" DrawAspect="Icon" ObjectID="_1838112050" r:id="rId13"/>
+          <o:OLEObject Type="Embed" ProgID="Package" ShapeID="_x0000_i1029" DrawAspect="Icon" ObjectID="_1838833837" r:id="rId13"/>
         </w:object>
       </w:r>
     </w:p>
@@ -6983,10 +6983,10 @@
       </w:r>
       <w:r>
         <w:object w:dxaOrig="1520" w:dyaOrig="987" w14:anchorId="3263CAA5">
-          <v:shape id="_x0000_i1028" type="#_x0000_t75" style="width:76.2pt;height:53.4pt" o:ole="">
+          <v:shape id="_x0000_i1030" type="#_x0000_t75" style="width:76pt;height:53.5pt" o:ole="">
             <v:imagedata r:id="rId14" o:title=""/>
           </v:shape>
-          <o:OLEObject Type="Embed" ProgID="Excel.Sheet.12" ShapeID="_x0000_i1028" DrawAspect="Icon" ObjectID="_1838112051" r:id="rId15"/>
+          <o:OLEObject Type="Embed" ProgID="Excel.Sheet.12" ShapeID="_x0000_i1030" DrawAspect="Icon" ObjectID="_1838833838" r:id="rId15"/>
         </w:object>
       </w:r>
     </w:p>
@@ -14726,25 +14726,25 @@
         <w:rPr>
           <w:i/>
           <w:iCs/>
-          <w:lang w:val="en-US"/>
-        </w:rPr>
-      </w:pPr>
-      <w:r>
-        <w:rPr>
-          <w:i/>
-          <w:iCs/>
-          <w:lang w:val="en-US"/>
-        </w:rPr>
-        <w:t xml:space="preserve">                base["yardsPerPlay"] = base["yardsTotal"] / plays</w:t>
-      </w:r>
-    </w:p>
-    <w:p>
-      <w:pPr>
-        <w:rPr>
-          <w:lang w:val="en-US"/>
-        </w:rPr>
-      </w:pPr>
-    </w:p>
+        </w:rPr>
+      </w:pPr>
+      <w:r>
+        <w:rPr>
+          <w:i/>
+          <w:iCs/>
+          <w:lang w:val="en-US"/>
+        </w:rPr>
+        <w:t xml:space="preserve">                </w:t>
+      </w:r>
+      <w:r>
+        <w:rPr>
+          <w:i/>
+          <w:iCs/>
+        </w:rPr>
+        <w:t>base["yardsPerPlay"] = base["yardsTotal"] / plays</w:t>
+      </w:r>
+    </w:p>
+    <w:p/>
     <w:p>
       <w:r>
         <w:t>Alors à ce niveau no</w:t>
@@ -14851,12 +14851,2185 @@
     </w:p>
     <w:p>
       <w:r>
-        <w:t xml:space="preserve">la récupération des données du Endpoint </w:t>
+        <w:t>L</w:t>
+      </w:r>
+      <w:r>
+        <w:t xml:space="preserve">a récupération des données du Endpoint </w:t>
       </w:r>
       <w:r>
         <w:t>"/games/players"</w:t>
       </w:r>
     </w:p>
+    <w:p/>
+    <w:p>
+      <w:r>
+        <w:t>Un autre problème que nous avons croisé a été que à force de solliciter l’API CFDB nous avons eu une limitation en termes de nombre d’accès par moi</w:t>
+      </w:r>
+      <w:r>
+        <w:t>s</w:t>
+      </w:r>
+      <w:r>
+        <w:t xml:space="preserve">. Du coup nous avons été obligés de récupérer les données par échantillons pour les transformer par la </w:t>
+      </w:r>
+      <w:r>
+        <w:t xml:space="preserve">suite. D’après les informations reçues s’était la bonne méthode dans la mesure ou déjà la sollicitation directe de </w:t>
+      </w:r>
+      <w:r>
+        <w:lastRenderedPageBreak/>
+        <w:t>L’API prenait énormément de temps rendait nos testes lent.</w:t>
+      </w:r>
+      <w:r>
+        <w:br/>
+        <w:t>Il existait trois solutions à cela la première était le paiement en ligne de l’Api afin d’y avoir accès en temps réel. La seconde option était d’attendre le mois suivant et la dernière était celle de la création de fichier json nous permettant de tester notre travail en temps réel.</w:t>
+      </w:r>
+      <w:r>
+        <w:t xml:space="preserve"> Et c’est cette dernière option que nous avons retenue.</w:t>
+      </w:r>
+      <w:r>
+        <w:br/>
+      </w:r>
+      <w:r>
+        <w:br/>
+        <w:t xml:space="preserve">Bien sur nous utilisons VS code dans le cadre de ce développement. Nous avons lié notre github à VScode du coup nous disposons de la possibilité de « commit » nos projets et de les pousser en ligne. </w:t>
+      </w:r>
+      <w:r>
+        <w:br/>
+        <w:t xml:space="preserve">Dans le cadre de cet exercice nous avons découverts les différents types de </w:t>
+      </w:r>
+      <w:r>
+        <w:rPr>
+          <w:i/>
+          <w:iCs/>
+        </w:rPr>
+        <w:t xml:space="preserve">commit </w:t>
+      </w:r>
+      <w:r>
+        <w:t>disponible</w:t>
+      </w:r>
+    </w:p>
+    <w:p>
+      <w:r>
+        <w:t>Voici les 4 types de "</w:t>
+      </w:r>
+      <w:r>
+        <w:rPr>
+          <w:i/>
+          <w:iCs/>
+        </w:rPr>
+        <w:t>commits</w:t>
+      </w:r>
+      <w:r>
+        <w:rPr>
+          <w:i/>
+          <w:iCs/>
+        </w:rPr>
+        <w:t>"</w:t>
+      </w:r>
+      <w:r>
+        <w:t xml:space="preserve"> qui existent : </w:t>
+      </w:r>
+    </w:p>
+    <w:p>
+      <w:pPr>
+        <w:pStyle w:val="ListParagraph"/>
+        <w:numPr>
+          <w:ilvl w:val="0"/>
+          <w:numId w:val="10"/>
+        </w:numPr>
+      </w:pPr>
+      <w:r>
+        <w:t xml:space="preserve">Le commit </w:t>
+      </w:r>
+    </w:p>
+    <w:p>
+      <w:pPr>
+        <w:pStyle w:val="ListParagraph"/>
+        <w:numPr>
+          <w:ilvl w:val="0"/>
+          <w:numId w:val="10"/>
+        </w:numPr>
+      </w:pPr>
+      <w:r>
+        <w:t>Le commit (Amend)</w:t>
+      </w:r>
+    </w:p>
+    <w:p>
+      <w:pPr>
+        <w:pStyle w:val="ListParagraph"/>
+        <w:numPr>
+          <w:ilvl w:val="0"/>
+          <w:numId w:val="10"/>
+        </w:numPr>
+      </w:pPr>
+      <w:r>
+        <w:t xml:space="preserve">Le commit &amp; push </w:t>
+      </w:r>
+    </w:p>
+    <w:p>
+      <w:pPr>
+        <w:pStyle w:val="ListParagraph"/>
+        <w:numPr>
+          <w:ilvl w:val="0"/>
+          <w:numId w:val="10"/>
+        </w:numPr>
+      </w:pPr>
+      <w:r>
+        <w:t>Le commit &amp; Sync</w:t>
+      </w:r>
+    </w:p>
+    <w:p/>
+    <w:p>
+      <w:pPr>
+        <w:pStyle w:val="ListParagraph"/>
+        <w:numPr>
+          <w:ilvl w:val="0"/>
+          <w:numId w:val="69"/>
+        </w:numPr>
+      </w:pPr>
+      <w:r>
+        <w:rPr>
+          <w:i/>
+          <w:iCs/>
+        </w:rPr>
+        <w:t>Le commit</w:t>
+      </w:r>
+      <w:r>
+        <w:t xml:space="preserve"> simple </w:t>
+      </w:r>
+    </w:p>
+    <w:p>
+      <w:r>
+        <w:t xml:space="preserve">Il ne fait que créer un </w:t>
+      </w:r>
+      <w:r>
+        <w:t xml:space="preserve">commit dans mon historique local mais absolument rien n’est envoyé </w:t>
+      </w:r>
+      <w:r>
+        <w:t>sur Github</w:t>
+      </w:r>
+      <w:r>
+        <w:t xml:space="preserve">  c’est juste une sauvegarde locale. </w:t>
+      </w:r>
+    </w:p>
+    <w:p>
+      <w:r>
+        <w:t xml:space="preserve">Quand l’utiliser ? </w:t>
+      </w:r>
+    </w:p>
+    <w:p>
+      <w:r>
+        <w:t>On l’utilise quand on veut avancer étapes par étapes sans encore pousser sur Github.</w:t>
+      </w:r>
+    </w:p>
+    <w:p>
+      <w:pPr>
+        <w:pStyle w:val="ListParagraph"/>
+        <w:numPr>
+          <w:ilvl w:val="0"/>
+          <w:numId w:val="69"/>
+        </w:numPr>
+        <w:rPr>
+          <w:i/>
+          <w:iCs/>
+        </w:rPr>
+      </w:pPr>
+      <w:r>
+        <w:rPr>
+          <w:i/>
+          <w:iCs/>
+        </w:rPr>
+        <w:t>Le commit(Amend)</w:t>
+      </w:r>
+    </w:p>
+    <w:p>
+      <w:r>
+        <w:t xml:space="preserve">Il modifie le dernier commit que je viens de faire. </w:t>
+      </w:r>
+    </w:p>
+    <w:p>
+      <w:r>
+        <w:t xml:space="preserve">Quand l’utiliser ? </w:t>
+      </w:r>
+    </w:p>
+    <w:p>
+      <w:pPr>
+        <w:pStyle w:val="ListParagraph"/>
+        <w:numPr>
+          <w:ilvl w:val="0"/>
+          <w:numId w:val="10"/>
+        </w:numPr>
+      </w:pPr>
+      <w:r>
+        <w:t>Quand j’ai oublié un fichier.</w:t>
+      </w:r>
+    </w:p>
+    <w:p>
+      <w:pPr>
+        <w:pStyle w:val="ListParagraph"/>
+        <w:numPr>
+          <w:ilvl w:val="0"/>
+          <w:numId w:val="10"/>
+        </w:numPr>
+      </w:pPr>
+      <w:r>
+        <w:t xml:space="preserve">Je souhaiterais corriger le message du commit </w:t>
+      </w:r>
+    </w:p>
+    <w:p>
+      <w:pPr>
+        <w:pStyle w:val="ListParagraph"/>
+        <w:numPr>
+          <w:ilvl w:val="0"/>
+          <w:numId w:val="10"/>
+        </w:numPr>
+      </w:pPr>
+      <w:r>
+        <w:t xml:space="preserve">Je souhaiterais ajouter une petite modification sans créer un nouveau commit </w:t>
+      </w:r>
+    </w:p>
+    <w:p>
+      <w:r>
+        <w:t xml:space="preserve">Attention : Uniquement quand tu n’as pas encore fait de </w:t>
+      </w:r>
+      <w:r>
+        <w:rPr>
+          <w:i/>
+          <w:iCs/>
+        </w:rPr>
+        <w:t>push</w:t>
+      </w:r>
+      <w:r>
+        <w:t>.</w:t>
+      </w:r>
+    </w:p>
+    <w:p/>
+    <w:p>
+      <w:pPr>
+        <w:pStyle w:val="ListParagraph"/>
+        <w:numPr>
+          <w:ilvl w:val="0"/>
+          <w:numId w:val="69"/>
+        </w:numPr>
+        <w:rPr>
+          <w:i/>
+          <w:iCs/>
+        </w:rPr>
+      </w:pPr>
+      <w:r>
+        <w:rPr>
+          <w:i/>
+          <w:iCs/>
+        </w:rPr>
+        <w:t>Commit &amp; Push</w:t>
+      </w:r>
+    </w:p>
+    <w:p>
+      <w:r>
+        <w:t>Il fait un commit local et l’envoie immédiatement sur Github.</w:t>
+      </w:r>
+    </w:p>
+    <w:p>
+      <w:r>
+        <w:t xml:space="preserve">Quand l’utiliser ? </w:t>
+      </w:r>
+    </w:p>
+    <w:p>
+      <w:pPr>
+        <w:pStyle w:val="ListParagraph"/>
+        <w:numPr>
+          <w:ilvl w:val="0"/>
+          <w:numId w:val="10"/>
+        </w:numPr>
+      </w:pPr>
+      <w:r>
+        <w:t xml:space="preserve">Quand tu veux que ton travail soit immédiatement en ligne </w:t>
+      </w:r>
+    </w:p>
+    <w:p>
+      <w:pPr>
+        <w:pStyle w:val="ListParagraph"/>
+        <w:numPr>
+          <w:ilvl w:val="0"/>
+          <w:numId w:val="10"/>
+        </w:numPr>
+      </w:pPr>
+      <w:r>
+        <w:t>Quand tu veux synchroniser ton travail avec Githu</w:t>
+      </w:r>
+      <w:r>
+        <w:t>b</w:t>
+      </w:r>
+    </w:p>
+    <w:p>
+      <w:pPr>
+        <w:pStyle w:val="ListParagraph"/>
+        <w:numPr>
+          <w:ilvl w:val="0"/>
+          <w:numId w:val="10"/>
+        </w:numPr>
+      </w:pPr>
+      <w:r>
+        <w:t xml:space="preserve">Quand tu veux sauvegarder ton avancement </w:t>
+      </w:r>
+    </w:p>
+    <w:p>
+      <w:r>
+        <w:t>C’est l’option la plus utilisée au quotidien.</w:t>
+      </w:r>
+    </w:p>
+    <w:p/>
+    <w:p>
+      <w:pPr>
+        <w:pStyle w:val="ListParagraph"/>
+        <w:numPr>
+          <w:ilvl w:val="0"/>
+          <w:numId w:val="69"/>
+        </w:numPr>
+      </w:pPr>
+      <w:r>
+        <w:lastRenderedPageBreak/>
+        <w:t xml:space="preserve">Commit &amp; Sync </w:t>
+      </w:r>
+    </w:p>
+    <w:p>
+      <w:r>
+        <w:t>Fait un commit + push + pull automatique.</w:t>
+      </w:r>
+    </w:p>
+    <w:p>
+      <w:r>
+        <w:t xml:space="preserve">A quoi ça sert ? </w:t>
+      </w:r>
+    </w:p>
+    <w:p>
+      <w:pPr>
+        <w:pStyle w:val="ListParagraph"/>
+        <w:numPr>
+          <w:ilvl w:val="0"/>
+          <w:numId w:val="10"/>
+        </w:numPr>
+      </w:pPr>
+      <w:r>
+        <w:t xml:space="preserve">Si tu travail à plusieurs </w:t>
+      </w:r>
+    </w:p>
+    <w:p>
+      <w:pPr>
+        <w:pStyle w:val="ListParagraph"/>
+        <w:numPr>
+          <w:ilvl w:val="0"/>
+          <w:numId w:val="10"/>
+        </w:numPr>
+      </w:pPr>
+      <w:r>
+        <w:t xml:space="preserve">Si tu veux </w:t>
+      </w:r>
+      <w:r>
+        <w:t>être sûr d’avoir la dernière version du dépôt</w:t>
+      </w:r>
+    </w:p>
+    <w:p>
+      <w:pPr>
+        <w:pStyle w:val="ListParagraph"/>
+        <w:numPr>
+          <w:ilvl w:val="0"/>
+          <w:numId w:val="10"/>
+        </w:numPr>
+      </w:pPr>
+      <w:r>
+        <w:t>Si tu veux éviter les conflits avant de pousser</w:t>
+      </w:r>
+    </w:p>
+    <w:p>
+      <w:r>
+        <w:t>Attention ça peut créer des merges automatiques si quelqu’ </w:t>
+      </w:r>
+      <w:r>
+        <w:t>un à</w:t>
+      </w:r>
+      <w:r>
+        <w:t xml:space="preserve"> modifié la branche entre temps.</w:t>
+      </w:r>
+    </w:p>
+    <w:p>
+      <w:r>
+        <w:t xml:space="preserve">Nous faisons maintenant un résumé de notre travail depuis que nous avons recommencé avec les fichiers Json : </w:t>
+      </w:r>
+      <w:r>
+        <w:br/>
+        <w:t>Dans notre pipeline Data engineering, On sépare toujours :</w:t>
+      </w:r>
+    </w:p>
+    <w:p>
+      <w:pPr>
+        <w:pStyle w:val="ListParagraph"/>
+        <w:numPr>
+          <w:ilvl w:val="0"/>
+          <w:numId w:val="70"/>
+        </w:numPr>
+      </w:pPr>
+      <w:r>
+        <w:t xml:space="preserve">Les Loaders </w:t>
+      </w:r>
+    </w:p>
+    <w:p>
+      <w:r>
+        <w:t xml:space="preserve">Ceux qui chargent les données brutes (API, JSON, CSV, Parquet …) </w:t>
+      </w:r>
+    </w:p>
+    <w:p>
+      <w:pPr>
+        <w:pStyle w:val="ListParagraph"/>
+        <w:numPr>
+          <w:ilvl w:val="0"/>
+          <w:numId w:val="70"/>
+        </w:numPr>
+      </w:pPr>
+      <w:r>
+        <w:t xml:space="preserve">Les Transformers </w:t>
+      </w:r>
+    </w:p>
+    <w:p>
+      <w:r>
+        <w:t xml:space="preserve">Ceux qui transforment les données en ligne plate exploitable </w:t>
+      </w:r>
+    </w:p>
+    <w:p>
+      <w:pPr>
+        <w:pStyle w:val="ListParagraph"/>
+        <w:numPr>
+          <w:ilvl w:val="0"/>
+          <w:numId w:val="70"/>
+        </w:numPr>
+      </w:pPr>
+      <w:r>
+        <w:t xml:space="preserve">Les Exporters </w:t>
+      </w:r>
+    </w:p>
+    <w:p>
+      <w:r>
+        <w:t>Ceux qui sauvegardent les données (CSV, Parquet, SQL … )</w:t>
+      </w:r>
+    </w:p>
+    <w:p>
+      <w:pPr>
+        <w:pStyle w:val="ListParagraph"/>
+        <w:numPr>
+          <w:ilvl w:val="0"/>
+          <w:numId w:val="70"/>
+        </w:numPr>
+      </w:pPr>
+      <w:r>
+        <w:t xml:space="preserve">Les Orchestrateurs </w:t>
+      </w:r>
+    </w:p>
+    <w:p>
+      <w:r>
+        <w:t>Ceux qui appellent les loaders -&gt; les Transformers -&gt; exporters</w:t>
+      </w:r>
+    </w:p>
+    <w:p>
+      <w:pPr>
+        <w:rPr>
+          <w:b/>
+          <w:bCs/>
+        </w:rPr>
+      </w:pPr>
+      <w:r>
+        <w:rPr>
+          <w:b/>
+          <w:bCs/>
+        </w:rPr>
+        <w:t xml:space="preserve">Pourquoi c’est indispensable de faire cette séparation ? </w:t>
+      </w:r>
+    </w:p>
+    <w:p>
+      <w:pPr>
+        <w:pStyle w:val="ListParagraph"/>
+        <w:numPr>
+          <w:ilvl w:val="0"/>
+          <w:numId w:val="71"/>
+        </w:numPr>
+      </w:pPr>
+      <w:r>
+        <w:t>Tu peux changer la source des données sans toucher au transformeur</w:t>
+      </w:r>
+    </w:p>
+    <w:p>
+      <w:r>
+        <w:t xml:space="preserve">Aujourd’hui : Json local </w:t>
+      </w:r>
+    </w:p>
+    <w:p>
+      <w:r>
+        <w:t xml:space="preserve">Demain : API </w:t>
+      </w:r>
+    </w:p>
+    <w:p>
+      <w:r>
+        <w:t xml:space="preserve">Après-demain : Base SQL </w:t>
+      </w:r>
+    </w:p>
+    <w:p>
+      <w:r>
+        <w:t>Le transformer ne change jamais.</w:t>
+      </w:r>
+    </w:p>
+    <w:p>
+      <w:pPr>
+        <w:pStyle w:val="ListParagraph"/>
+        <w:numPr>
+          <w:ilvl w:val="0"/>
+          <w:numId w:val="71"/>
+        </w:numPr>
+      </w:pPr>
+      <w:r>
+        <w:t xml:space="preserve">Tu peux tester ton transformer indépendamment </w:t>
+      </w:r>
+    </w:p>
+    <w:p>
+      <w:r>
+        <w:t>Tu charges un fichier local tu transformes et tu testes.</w:t>
+      </w:r>
+    </w:p>
+    <w:p>
+      <w:pPr>
+        <w:pStyle w:val="ListParagraph"/>
+        <w:numPr>
+          <w:ilvl w:val="0"/>
+          <w:numId w:val="71"/>
+        </w:numPr>
+      </w:pPr>
+      <w:r>
+        <w:t xml:space="preserve">Tu peux réutiliser tes loaders dans plusieurs pipelines </w:t>
+      </w:r>
+    </w:p>
+    <w:p>
+      <w:r>
+        <w:t>Exemple : un pipeline analytics, un pipeline ML, un pipeline dashbord</w:t>
+      </w:r>
+    </w:p>
+    <w:p>
+      <w:pPr>
+        <w:pStyle w:val="ListParagraph"/>
+        <w:numPr>
+          <w:ilvl w:val="0"/>
+          <w:numId w:val="71"/>
+        </w:numPr>
+      </w:pPr>
+      <w:r>
+        <w:t xml:space="preserve">J’évite les dépendances circulaires </w:t>
+      </w:r>
+    </w:p>
+    <w:p>
+      <w:r>
+        <w:t>Si tu mets tous dans un seul fichier, tu vas vite te retrouver bloqué</w:t>
+      </w:r>
+    </w:p>
+    <w:p>
+      <w:pPr>
+        <w:pStyle w:val="ListParagraph"/>
+        <w:numPr>
+          <w:ilvl w:val="0"/>
+          <w:numId w:val="71"/>
+        </w:numPr>
+      </w:pPr>
+      <w:r>
+        <w:t xml:space="preserve">C’est la norme dans les entreprises </w:t>
+      </w:r>
+    </w:p>
+    <w:p>
+      <w:r>
+        <w:t>C’est exactement ce que font Airflow , Dagster, Perfect, Luigi , Kedro</w:t>
+      </w:r>
+    </w:p>
+    <w:p>
+      <w:r>
+        <w:lastRenderedPageBreak/>
+        <w:t xml:space="preserve">Toujours dans le but de rendre ce travail exemplaire je me suis pausé la question de savoir à partir de mon pipeline n’est il pas possible pour moi de faire une comparaison des matchs dans le temps entre deux équipes du championnat. C’est-à-dire avoir l’historique de leurs confrontations d’une part et de l’autres l’historique des confrontations des joueurs et des entraineurs. A cette question on ‘a réalisé que les confrontations entre joueurs </w:t>
+      </w:r>
+      <w:r>
+        <w:t>manquaient</w:t>
+      </w:r>
+      <w:r>
+        <w:t xml:space="preserve"> d’intérêt mais par contre celle</w:t>
+      </w:r>
+      <w:r>
+        <w:t>s</w:t>
+      </w:r>
+      <w:r>
+        <w:t xml:space="preserve"> entre équipe</w:t>
+      </w:r>
+      <w:r>
+        <w:t>s</w:t>
+      </w:r>
+      <w:r>
+        <w:t xml:space="preserve"> et coach</w:t>
+      </w:r>
+      <w:r>
+        <w:t>s</w:t>
+      </w:r>
+      <w:r>
+        <w:t xml:space="preserve"> avai</w:t>
+      </w:r>
+      <w:r>
+        <w:t>ent</w:t>
+      </w:r>
+      <w:r>
+        <w:t xml:space="preserve"> plus de sens et donc nous avons décidé de compléter notre projet</w:t>
+      </w:r>
+      <w:r>
+        <w:t xml:space="preserve"> par les</w:t>
+      </w:r>
+      <w:r>
+        <w:t xml:space="preserve"> deux (Joueurs, et </w:t>
+      </w:r>
+      <w:r>
+        <w:t>entraineur)</w:t>
+      </w:r>
+      <w:r>
+        <w:t>.</w:t>
+      </w:r>
+    </w:p>
+    <w:p>
+      <w:r>
+        <w:t xml:space="preserve">Nous sommes pour ce faire partie pour avoir une réponse claire : </w:t>
+      </w:r>
+      <w:r>
+        <w:rPr>
+          <w:b/>
+          <w:bCs/>
+        </w:rPr>
+        <w:t>“Comment les conférences se comportent les unes contre les autres ?”</w:t>
+      </w:r>
+      <w:r>
+        <w:rPr>
+          <w:b/>
+          <w:bCs/>
+        </w:rPr>
+        <w:t xml:space="preserve">(SEC vs BIG Ten, BIG12 vs ACC </w:t>
+      </w:r>
+      <w:r>
+        <w:rPr>
+          <w:b/>
+          <w:bCs/>
+        </w:rPr>
+        <w:t>etc.</w:t>
+      </w:r>
+      <w:r>
+        <w:rPr>
+          <w:b/>
+          <w:bCs/>
+        </w:rPr>
+        <w:t>)</w:t>
+      </w:r>
+    </w:p>
+    <w:p>
+      <w:pPr>
+        <w:pStyle w:val="ListParagraph"/>
+        <w:numPr>
+          <w:ilvl w:val="0"/>
+          <w:numId w:val="72"/>
+        </w:numPr>
+      </w:pPr>
+      <w:r>
+        <w:t>Les données dont nous avons besoin.</w:t>
+      </w:r>
+    </w:p>
+    <w:p>
+      <w:r>
+        <w:t>Du coup nous allons croiser les Endpoints : "/games" et "/teams"</w:t>
+      </w:r>
+    </w:p>
+    <w:p>
+      <w:r>
+        <w:rPr>
+          <w:i/>
+          <w:iCs/>
+        </w:rPr>
+        <w:t>"/games"</w:t>
+      </w:r>
+      <w:r>
+        <w:rPr>
+          <w:i/>
+          <w:iCs/>
+        </w:rPr>
+        <w:t xml:space="preserve"> </w:t>
+      </w:r>
+      <w:r>
+        <w:t xml:space="preserve"> -&gt; qui joue contre qui, quand, score, neutral_site, postseason, etc .</w:t>
+      </w:r>
+    </w:p>
+    <w:p>
+      <w:r>
+        <w:t>"/teams"</w:t>
+      </w:r>
+      <w:r>
+        <w:rPr>
+          <w:i/>
+          <w:iCs/>
+        </w:rPr>
+        <w:t xml:space="preserve"> </w:t>
+      </w:r>
+      <w:r>
+        <w:t>-&gt; à quelle conférence appartient chaque équipe.</w:t>
+      </w:r>
+    </w:p>
+    <w:p>
+      <w:r>
+        <w:t xml:space="preserve">Idée clé : </w:t>
+      </w:r>
+    </w:p>
+    <w:p>
+      <w:r>
+        <w:t xml:space="preserve">Pour chaque match, nous identifions : </w:t>
+      </w:r>
+    </w:p>
+    <w:p>
+      <w:pPr>
+        <w:pStyle w:val="ListParagraph"/>
+        <w:numPr>
+          <w:ilvl w:val="0"/>
+          <w:numId w:val="10"/>
+        </w:numPr>
+        <w:rPr>
+          <w:i/>
+          <w:iCs/>
+        </w:rPr>
+      </w:pPr>
+      <w:r>
+        <w:rPr>
+          <w:i/>
+          <w:iCs/>
+        </w:rPr>
+        <w:t>Home_conférence</w:t>
+      </w:r>
+    </w:p>
+    <w:p>
+      <w:pPr>
+        <w:pStyle w:val="ListParagraph"/>
+        <w:numPr>
+          <w:ilvl w:val="0"/>
+          <w:numId w:val="10"/>
+        </w:numPr>
+        <w:rPr>
+          <w:i/>
+          <w:iCs/>
+        </w:rPr>
+      </w:pPr>
+      <w:r>
+        <w:rPr>
+          <w:i/>
+          <w:iCs/>
+        </w:rPr>
+        <w:t>Away_conférence</w:t>
+      </w:r>
+    </w:p>
+    <w:p>
+      <w:pPr>
+        <w:pStyle w:val="ListParagraph"/>
+        <w:numPr>
+          <w:ilvl w:val="0"/>
+          <w:numId w:val="10"/>
+        </w:numPr>
+        <w:rPr>
+          <w:i/>
+          <w:iCs/>
+        </w:rPr>
+      </w:pPr>
+      <w:r>
+        <w:t xml:space="preserve">Puis nous gardons uniquement les matchs où </w:t>
+      </w:r>
+      <w:r>
+        <w:rPr>
+          <w:i/>
+          <w:iCs/>
+        </w:rPr>
+        <w:t>Home_conférence</w:t>
+      </w:r>
+      <w:r>
+        <w:rPr>
+          <w:i/>
+          <w:iCs/>
+        </w:rPr>
+        <w:t xml:space="preserve"> != </w:t>
+      </w:r>
+      <w:r>
+        <w:rPr>
+          <w:i/>
+          <w:iCs/>
+        </w:rPr>
+        <w:t>Away_conférence</w:t>
+      </w:r>
+    </w:p>
+    <w:p/>
+    <w:p>
+      <w:pPr>
+        <w:pStyle w:val="ListParagraph"/>
+        <w:numPr>
+          <w:ilvl w:val="0"/>
+          <w:numId w:val="72"/>
+        </w:numPr>
+      </w:pPr>
+      <w:r>
+        <w:t xml:space="preserve">Structure du dataset final " conférence </w:t>
+      </w:r>
+      <w:r>
+        <w:t>matchup"</w:t>
+      </w:r>
+    </w:p>
+    <w:p>
+      <w:r>
+        <w:t xml:space="preserve">Nous proposons une structure plate, exploitable en analytics : </w:t>
+      </w:r>
+    </w:p>
+    <w:p>
+      <w:pPr>
+        <w:pStyle w:val="ListParagraph"/>
+        <w:numPr>
+          <w:ilvl w:val="0"/>
+          <w:numId w:val="10"/>
+        </w:numPr>
+      </w:pPr>
+      <w:r>
+        <w:t xml:space="preserve">season </w:t>
+      </w:r>
+    </w:p>
+    <w:p>
+      <w:pPr>
+        <w:pStyle w:val="ListParagraph"/>
+        <w:numPr>
+          <w:ilvl w:val="0"/>
+          <w:numId w:val="10"/>
+        </w:numPr>
+      </w:pPr>
+      <w:r>
+        <w:t>week</w:t>
+      </w:r>
+    </w:p>
+    <w:p>
+      <w:pPr>
+        <w:pStyle w:val="ListParagraph"/>
+        <w:numPr>
+          <w:ilvl w:val="0"/>
+          <w:numId w:val="10"/>
+        </w:numPr>
+      </w:pPr>
+      <w:r>
+        <w:t>season_type(regular, postseason)</w:t>
+      </w:r>
+    </w:p>
+    <w:p>
+      <w:pPr>
+        <w:pStyle w:val="ListParagraph"/>
+        <w:numPr>
+          <w:ilvl w:val="0"/>
+          <w:numId w:val="10"/>
+        </w:numPr>
+      </w:pPr>
+      <w:r>
+        <w:t>game_id</w:t>
+      </w:r>
+    </w:p>
+    <w:p>
+      <w:pPr>
+        <w:pStyle w:val="ListParagraph"/>
+        <w:numPr>
+          <w:ilvl w:val="0"/>
+          <w:numId w:val="10"/>
+        </w:numPr>
+      </w:pPr>
+      <w:r>
+        <w:t>home_team</w:t>
+      </w:r>
+    </w:p>
+    <w:p>
+      <w:pPr>
+        <w:pStyle w:val="ListParagraph"/>
+        <w:numPr>
+          <w:ilvl w:val="0"/>
+          <w:numId w:val="10"/>
+        </w:numPr>
+      </w:pPr>
+      <w:r>
+        <w:t>away_team</w:t>
+      </w:r>
+    </w:p>
+    <w:p>
+      <w:pPr>
+        <w:pStyle w:val="ListParagraph"/>
+        <w:numPr>
+          <w:ilvl w:val="0"/>
+          <w:numId w:val="10"/>
+        </w:numPr>
+      </w:pPr>
+      <w:r>
+        <w:t>home_conference</w:t>
+      </w:r>
+    </w:p>
+    <w:p>
+      <w:pPr>
+        <w:pStyle w:val="ListParagraph"/>
+        <w:numPr>
+          <w:ilvl w:val="0"/>
+          <w:numId w:val="10"/>
+        </w:numPr>
+      </w:pPr>
+      <w:r>
+        <w:t>away_conference</w:t>
+      </w:r>
+    </w:p>
+    <w:p>
+      <w:pPr>
+        <w:pStyle w:val="ListParagraph"/>
+        <w:numPr>
+          <w:ilvl w:val="0"/>
+          <w:numId w:val="10"/>
+        </w:numPr>
+      </w:pPr>
+      <w:r>
+        <w:t>home_points</w:t>
+      </w:r>
+    </w:p>
+    <w:p>
+      <w:pPr>
+        <w:pStyle w:val="ListParagraph"/>
+        <w:numPr>
+          <w:ilvl w:val="0"/>
+          <w:numId w:val="10"/>
+        </w:numPr>
+      </w:pPr>
+      <w:r>
+        <w:t>away_points</w:t>
+      </w:r>
+    </w:p>
+    <w:p>
+      <w:pPr>
+        <w:pStyle w:val="ListParagraph"/>
+        <w:numPr>
+          <w:ilvl w:val="0"/>
+          <w:numId w:val="10"/>
+        </w:numPr>
+      </w:pPr>
+      <w:r>
+        <w:t>winner_conference</w:t>
+      </w:r>
+    </w:p>
+    <w:p>
+      <w:pPr>
+        <w:pStyle w:val="ListParagraph"/>
+        <w:numPr>
+          <w:ilvl w:val="0"/>
+          <w:numId w:val="10"/>
+        </w:numPr>
+      </w:pPr>
+      <w:r>
+        <w:t>loser_conference</w:t>
+      </w:r>
+    </w:p>
+    <w:p>
+      <w:pPr>
+        <w:pStyle w:val="ListParagraph"/>
+        <w:numPr>
+          <w:ilvl w:val="0"/>
+          <w:numId w:val="10"/>
+        </w:numPr>
+        <w:rPr>
+          <w:lang w:val="en-US"/>
+        </w:rPr>
+      </w:pPr>
+      <w:r>
+        <w:rPr>
+          <w:lang w:val="en-US"/>
+        </w:rPr>
+        <w:t>margin (abs (</w:t>
+      </w:r>
+      <w:r>
+        <w:rPr>
+          <w:lang w:val="en-US"/>
+        </w:rPr>
+        <w:t>home_points</w:t>
+      </w:r>
+      <w:r>
+        <w:rPr>
+          <w:lang w:val="en-US"/>
+        </w:rPr>
+        <w:t xml:space="preserve"> </w:t>
+      </w:r>
+      <w:r>
+        <w:rPr>
+          <w:lang w:val="en-US"/>
+        </w:rPr>
+        <w:t>-</w:t>
+      </w:r>
+      <w:r>
+        <w:rPr>
+          <w:lang w:val="en-US"/>
+        </w:rPr>
+        <w:t xml:space="preserve"> </w:t>
+      </w:r>
+      <w:r>
+        <w:rPr>
+          <w:lang w:val="en-US"/>
+        </w:rPr>
+        <w:t>a</w:t>
+      </w:r>
+      <w:r>
+        <w:rPr>
+          <w:lang w:val="en-US"/>
+        </w:rPr>
+        <w:t>way_points))</w:t>
+      </w:r>
+    </w:p>
+    <w:p>
+      <w:pPr>
+        <w:pStyle w:val="ListParagraph"/>
+        <w:numPr>
+          <w:ilvl w:val="0"/>
+          <w:numId w:val="10"/>
+        </w:numPr>
+        <w:rPr>
+          <w:lang w:val="en-US"/>
+        </w:rPr>
+      </w:pPr>
+      <w:r>
+        <w:rPr>
+          <w:lang w:val="en-US"/>
+        </w:rPr>
+        <w:t>neutral_site(bool)</w:t>
+      </w:r>
+    </w:p>
+    <w:p>
+      <w:pPr>
+        <w:pStyle w:val="ListParagraph"/>
+        <w:numPr>
+          <w:ilvl w:val="0"/>
+          <w:numId w:val="10"/>
+        </w:numPr>
+      </w:pPr>
+      <w:r>
+        <w:t>is_bowl_</w:t>
+      </w:r>
+      <w:r>
+        <w:t>game (</w:t>
+      </w:r>
+      <w:r>
+        <w:t>bool, si tu le dérives)</w:t>
+      </w:r>
+    </w:p>
+    <w:p>
+      <w:pPr>
+        <w:pStyle w:val="ListParagraph"/>
+        <w:numPr>
+          <w:ilvl w:val="0"/>
+          <w:numId w:val="10"/>
+        </w:numPr>
+      </w:pPr>
+      <w:r>
+        <w:t>is_playoff_</w:t>
+      </w:r>
+      <w:r>
+        <w:t>game (</w:t>
+      </w:r>
+      <w:r>
+        <w:t xml:space="preserve">bool, si </w:t>
+      </w:r>
+      <w:r>
+        <w:t>tu le</w:t>
+      </w:r>
+      <w:r>
+        <w:t xml:space="preserve"> dérives</w:t>
+      </w:r>
+      <w:r>
+        <w:t>)</w:t>
+      </w:r>
+    </w:p>
+    <w:p/>
+    <w:p>
+      <w:r>
+        <w:lastRenderedPageBreak/>
+        <w:t>Alors dans le cas de mon fichier "</w:t>
+      </w:r>
+      <w:r>
+        <w:rPr>
+          <w:i/>
+          <w:iCs/>
+        </w:rPr>
+        <w:t>conference matchup</w:t>
+      </w:r>
+      <w:r>
+        <w:t xml:space="preserve">" nous avons un problème le json d’échantillon n’existe pas dans CFBD du coup la conséquence directe est que je vais créer mon propre Json à partir des Endpoints </w:t>
+      </w:r>
+      <w:r>
+        <w:t xml:space="preserve">"/games" </w:t>
+      </w:r>
+      <w:r>
+        <w:t>+</w:t>
+      </w:r>
+      <w:r>
+        <w:t xml:space="preserve"> "/teams"</w:t>
+      </w:r>
+      <w:r>
+        <w:t xml:space="preserve">. </w:t>
+      </w:r>
+    </w:p>
+    <w:p>
+      <w:r>
+        <w:t>Etant donné que je ne veux pas simplement consommer j’ai défini les étapes suivantes pour atteindre cet objectif :</w:t>
+      </w:r>
+      <w:r>
+        <w:br/>
+        <w:t xml:space="preserve">        1.    Etape 1 : Identification des sources de données.</w:t>
+      </w:r>
+    </w:p>
+    <w:p>
+      <w:pPr>
+        <w:pStyle w:val="ListParagraph"/>
+        <w:numPr>
+          <w:ilvl w:val="0"/>
+          <w:numId w:val="46"/>
+        </w:numPr>
+      </w:pPr>
+      <w:r>
+        <w:t xml:space="preserve">Etape 2 :  Décider de ce que je veux dans le dataset final </w:t>
+      </w:r>
+    </w:p>
+    <w:p>
+      <w:r>
+        <w:t>Les champs pertinents pour l’Analyse.</w:t>
+      </w:r>
+    </w:p>
+    <w:p>
+      <w:pPr>
+        <w:pStyle w:val="ListParagraph"/>
+        <w:numPr>
+          <w:ilvl w:val="0"/>
+          <w:numId w:val="46"/>
+        </w:numPr>
+      </w:pPr>
+      <w:r>
+        <w:t xml:space="preserve">Etape 3 : construction d’un échantillon json réaliste </w:t>
+      </w:r>
+    </w:p>
+    <w:p>
+      <w:pPr>
+        <w:pStyle w:val="ListParagraph"/>
+        <w:numPr>
+          <w:ilvl w:val="0"/>
+          <w:numId w:val="46"/>
+        </w:numPr>
+      </w:pPr>
+      <w:r>
+        <w:t xml:space="preserve">Etape 4 : Créer mon loader </w:t>
+      </w:r>
+    </w:p>
+    <w:p>
+      <w:pPr>
+        <w:pStyle w:val="ListParagraph"/>
+        <w:numPr>
+          <w:ilvl w:val="0"/>
+          <w:numId w:val="46"/>
+        </w:numPr>
+      </w:pPr>
+      <w:r>
+        <w:t>Ecrire mon transformer</w:t>
+      </w:r>
+    </w:p>
+    <w:p/>
+    <w:p>
+      <w:r>
+        <w:t>Voilà</w:t>
+      </w:r>
+      <w:r>
+        <w:t xml:space="preserve"> mon </w:t>
+      </w:r>
+      <w:r>
+        <w:t xml:space="preserve">échantillon </w:t>
+      </w:r>
+      <w:r>
+        <w:t xml:space="preserve">json fait par </w:t>
+      </w:r>
+      <w:r>
+        <w:t xml:space="preserve">moi-même. </w:t>
+      </w:r>
+    </w:p>
+    <w:p>
+      <w:pPr>
+        <w:pStyle w:val="ListParagraph"/>
+        <w:numPr>
+          <w:ilvl w:val="0"/>
+          <w:numId w:val="73"/>
+        </w:numPr>
+      </w:pPr>
+      <w:r>
+        <w:t xml:space="preserve">Les données sources nécessaires : </w:t>
+      </w:r>
+    </w:p>
+    <w:p>
+      <w:pPr>
+        <w:pStyle w:val="ListParagraph"/>
+        <w:numPr>
+          <w:ilvl w:val="0"/>
+          <w:numId w:val="10"/>
+        </w:numPr>
+      </w:pPr>
+      <w:r>
+        <w:t>Les matchs (/games)</w:t>
+      </w:r>
+    </w:p>
+    <w:p>
+      <w:pPr>
+        <w:rPr>
+          <w:i/>
+          <w:iCs/>
+          <w:lang w:val="en-US"/>
+        </w:rPr>
+      </w:pPr>
+      <w:r>
+        <w:rPr>
+          <w:i/>
+          <w:iCs/>
+          <w:lang w:val="en-US"/>
+        </w:rPr>
+        <w:t>{</w:t>
+      </w:r>
+    </w:p>
+    <w:p>
+      <w:pPr>
+        <w:rPr>
+          <w:i/>
+          <w:iCs/>
+          <w:lang w:val="en-US"/>
+        </w:rPr>
+      </w:pPr>
+      <w:r>
+        <w:rPr>
+          <w:i/>
+          <w:iCs/>
+          <w:lang w:val="en-US"/>
+        </w:rPr>
+        <w:t xml:space="preserve">  "id": 401282001,</w:t>
+      </w:r>
+    </w:p>
+    <w:p>
+      <w:pPr>
+        <w:rPr>
+          <w:i/>
+          <w:iCs/>
+          <w:lang w:val="en-US"/>
+        </w:rPr>
+      </w:pPr>
+      <w:r>
+        <w:rPr>
+          <w:i/>
+          <w:iCs/>
+          <w:lang w:val="en-US"/>
+        </w:rPr>
+        <w:t xml:space="preserve">  "season": 2023,</w:t>
+      </w:r>
+    </w:p>
+    <w:p>
+      <w:pPr>
+        <w:rPr>
+          <w:i/>
+          <w:iCs/>
+          <w:lang w:val="en-US"/>
+        </w:rPr>
+      </w:pPr>
+      <w:r>
+        <w:rPr>
+          <w:i/>
+          <w:iCs/>
+          <w:lang w:val="en-US"/>
+        </w:rPr>
+        <w:t xml:space="preserve">  "week": 1,</w:t>
+      </w:r>
+    </w:p>
+    <w:p>
+      <w:pPr>
+        <w:rPr>
+          <w:i/>
+          <w:iCs/>
+          <w:lang w:val="en-US"/>
+        </w:rPr>
+      </w:pPr>
+      <w:r>
+        <w:rPr>
+          <w:i/>
+          <w:iCs/>
+          <w:lang w:val="en-US"/>
+        </w:rPr>
+        <w:t xml:space="preserve">  "season_type": "regular",</w:t>
+      </w:r>
+    </w:p>
+    <w:p>
+      <w:pPr>
+        <w:rPr>
+          <w:i/>
+          <w:iCs/>
+          <w:lang w:val="en-US"/>
+        </w:rPr>
+      </w:pPr>
+      <w:r>
+        <w:rPr>
+          <w:i/>
+          <w:iCs/>
+          <w:lang w:val="en-US"/>
+        </w:rPr>
+        <w:t xml:space="preserve">  "home_team": "Alabama",</w:t>
+      </w:r>
+    </w:p>
+    <w:p>
+      <w:pPr>
+        <w:rPr>
+          <w:i/>
+          <w:iCs/>
+          <w:lang w:val="en-US"/>
+        </w:rPr>
+      </w:pPr>
+      <w:r>
+        <w:rPr>
+          <w:i/>
+          <w:iCs/>
+          <w:lang w:val="en-US"/>
+        </w:rPr>
+        <w:t xml:space="preserve">  "away_team": "Texas",</w:t>
+      </w:r>
+    </w:p>
+    <w:p>
+      <w:pPr>
+        <w:rPr>
+          <w:i/>
+          <w:iCs/>
+          <w:lang w:val="en-US"/>
+        </w:rPr>
+      </w:pPr>
+      <w:r>
+        <w:rPr>
+          <w:i/>
+          <w:iCs/>
+          <w:lang w:val="en-US"/>
+        </w:rPr>
+        <w:t xml:space="preserve">  "home_points": 24,</w:t>
+      </w:r>
+    </w:p>
+    <w:p>
+      <w:pPr>
+        <w:rPr>
+          <w:i/>
+          <w:iCs/>
+          <w:lang w:val="en-US"/>
+        </w:rPr>
+      </w:pPr>
+      <w:r>
+        <w:rPr>
+          <w:i/>
+          <w:iCs/>
+          <w:lang w:val="en-US"/>
+        </w:rPr>
+        <w:t xml:space="preserve">  "away_points": 34,</w:t>
+      </w:r>
+    </w:p>
+    <w:p>
+      <w:pPr>
+        <w:rPr>
+          <w:lang w:val="en-US"/>
+        </w:rPr>
+      </w:pPr>
+      <w:r>
+        <w:rPr>
+          <w:i/>
+          <w:iCs/>
+          <w:lang w:val="en-US"/>
+        </w:rPr>
+        <w:t xml:space="preserve">  "neutral_site</w:t>
+      </w:r>
+      <w:r>
+        <w:rPr>
+          <w:lang w:val="en-US"/>
+        </w:rPr>
+        <w:t>": false</w:t>
+      </w:r>
+    </w:p>
+    <w:p>
+      <w:r>
+        <w:t>}</w:t>
+      </w:r>
+    </w:p>
+    <w:p>
+      <w:pPr>
+        <w:pStyle w:val="ListParagraph"/>
+        <w:numPr>
+          <w:ilvl w:val="0"/>
+          <w:numId w:val="10"/>
+        </w:numPr>
+      </w:pPr>
+      <w:r>
+        <w:t>Les équipes (/teams)</w:t>
+      </w:r>
+    </w:p>
+    <w:p>
+      <w:pPr>
+        <w:rPr>
+          <w:i/>
+          <w:iCs/>
+        </w:rPr>
+      </w:pPr>
+      <w:r>
+        <w:rPr>
+          <w:i/>
+          <w:iCs/>
+        </w:rPr>
+        <w:t>{</w:t>
+      </w:r>
+    </w:p>
+    <w:p>
+      <w:pPr>
+        <w:rPr>
+          <w:i/>
+          <w:iCs/>
+        </w:rPr>
+      </w:pPr>
+      <w:r>
+        <w:rPr>
+          <w:i/>
+          <w:iCs/>
+        </w:rPr>
+        <w:t xml:space="preserve">  "school": "Alabama",</w:t>
+      </w:r>
+    </w:p>
+    <w:p>
+      <w:pPr>
+        <w:rPr>
+          <w:i/>
+          <w:iCs/>
+        </w:rPr>
+      </w:pPr>
+      <w:r>
+        <w:rPr>
+          <w:i/>
+          <w:iCs/>
+        </w:rPr>
+        <w:t xml:space="preserve">  "conference"</w:t>
+      </w:r>
+      <w:r>
+        <w:rPr>
+          <w:i/>
+          <w:iCs/>
+        </w:rPr>
+        <w:t xml:space="preserve"> </w:t>
+      </w:r>
+      <w:r>
+        <w:rPr>
+          <w:i/>
+          <w:iCs/>
+        </w:rPr>
+        <w:t>: "SEC"</w:t>
+      </w:r>
+    </w:p>
+    <w:p>
+      <w:pPr>
+        <w:rPr>
+          <w:i/>
+          <w:iCs/>
+        </w:rPr>
+      </w:pPr>
+      <w:r>
+        <w:rPr>
+          <w:i/>
+          <w:iCs/>
+        </w:rPr>
+        <w:t>}</w:t>
+      </w:r>
+    </w:p>
+    <w:p>
+      <w:pPr>
+        <w:pStyle w:val="ListParagraph"/>
+        <w:numPr>
+          <w:ilvl w:val="0"/>
+          <w:numId w:val="73"/>
+        </w:numPr>
+      </w:pPr>
+      <w:r>
+        <w:t xml:space="preserve">Ce que nous voulons dans le dataset final </w:t>
+      </w:r>
+    </w:p>
+    <w:p>
+      <w:r>
+        <w:t>Voilà ce que nous voulons finalement.</w:t>
+      </w:r>
+    </w:p>
+    <w:p/>
+    <w:p>
+      <w:pPr>
+        <w:pStyle w:val="ListParagraph"/>
+        <w:numPr>
+          <w:ilvl w:val="0"/>
+          <w:numId w:val="10"/>
+        </w:numPr>
+        <w:spacing w:before="100" w:beforeAutospacing="1" w:after="100" w:afterAutospacing="1" w:line="240" w:lineRule="auto"/>
+        <w:rPr>
+          <w:rFonts w:eastAsia="Times New Roman" w:cs="Times New Roman"/>
+          <w:kern w:val="0"/>
+          <w:lang w:val="en-US" w:eastAsia="fr-LU"/>
+          <w14:ligatures w14:val="none"/>
+        </w:rPr>
+      </w:pPr>
+      <w:r>
+        <w:rPr>
+          <w:rFonts w:eastAsia="Times New Roman" w:cs="Times New Roman"/>
+          <w:kern w:val="0"/>
+          <w:lang w:val="en-US" w:eastAsia="fr-LU"/>
+          <w14:ligatures w14:val="none"/>
+        </w:rPr>
+        <w:lastRenderedPageBreak/>
+        <w:t>s</w:t>
+      </w:r>
+      <w:r>
+        <w:rPr>
+          <w:rFonts w:eastAsia="Times New Roman" w:cs="Times New Roman"/>
+          <w:kern w:val="0"/>
+          <w:lang w:val="en-US" w:eastAsia="fr-LU"/>
+          <w14:ligatures w14:val="none"/>
+        </w:rPr>
+        <w:t>eason</w:t>
+      </w:r>
+    </w:p>
+    <w:p>
+      <w:pPr>
+        <w:pStyle w:val="ListParagraph"/>
+        <w:numPr>
+          <w:ilvl w:val="0"/>
+          <w:numId w:val="10"/>
+        </w:numPr>
+        <w:spacing w:before="100" w:beforeAutospacing="1" w:after="100" w:afterAutospacing="1" w:line="240" w:lineRule="auto"/>
+        <w:rPr>
+          <w:rFonts w:eastAsia="Times New Roman" w:cs="Times New Roman"/>
+          <w:kern w:val="0"/>
+          <w:lang w:val="en-US" w:eastAsia="fr-LU"/>
+          <w14:ligatures w14:val="none"/>
+        </w:rPr>
+      </w:pPr>
+      <w:r>
+        <w:rPr>
+          <w:rFonts w:eastAsia="Times New Roman" w:cs="Times New Roman"/>
+          <w:kern w:val="0"/>
+          <w:lang w:val="en-US" w:eastAsia="fr-LU"/>
+          <w14:ligatures w14:val="none"/>
+        </w:rPr>
+        <w:t xml:space="preserve"> </w:t>
+      </w:r>
+      <w:r>
+        <w:rPr>
+          <w:rFonts w:eastAsia="Times New Roman" w:cs="Times New Roman"/>
+          <w:kern w:val="0"/>
+          <w:lang w:val="en-US" w:eastAsia="fr-LU"/>
+          <w14:ligatures w14:val="none"/>
+        </w:rPr>
+        <w:t>w</w:t>
+      </w:r>
+      <w:r>
+        <w:rPr>
+          <w:rFonts w:eastAsia="Times New Roman" w:cs="Times New Roman"/>
+          <w:kern w:val="0"/>
+          <w:lang w:val="en-US" w:eastAsia="fr-LU"/>
+          <w14:ligatures w14:val="none"/>
+        </w:rPr>
+        <w:t>eek</w:t>
+      </w:r>
+    </w:p>
+    <w:p>
+      <w:pPr>
+        <w:pStyle w:val="ListParagraph"/>
+        <w:numPr>
+          <w:ilvl w:val="0"/>
+          <w:numId w:val="10"/>
+        </w:numPr>
+        <w:spacing w:before="100" w:beforeAutospacing="1" w:after="100" w:afterAutospacing="1" w:line="240" w:lineRule="auto"/>
+        <w:rPr>
+          <w:rFonts w:eastAsia="Times New Roman" w:cs="Times New Roman"/>
+          <w:kern w:val="0"/>
+          <w:lang w:val="en-US" w:eastAsia="fr-LU"/>
+          <w14:ligatures w14:val="none"/>
+        </w:rPr>
+      </w:pPr>
+      <w:r>
+        <w:rPr>
+          <w:rFonts w:eastAsia="Times New Roman" w:cs="Times New Roman"/>
+          <w:kern w:val="0"/>
+          <w:lang w:val="en-US" w:eastAsia="fr-LU"/>
+          <w14:ligatures w14:val="none"/>
+        </w:rPr>
+        <w:t>season_type</w:t>
+      </w:r>
+    </w:p>
+    <w:p>
+      <w:pPr>
+        <w:pStyle w:val="ListParagraph"/>
+        <w:numPr>
+          <w:ilvl w:val="0"/>
+          <w:numId w:val="10"/>
+        </w:numPr>
+        <w:spacing w:before="100" w:beforeAutospacing="1" w:after="100" w:afterAutospacing="1" w:line="240" w:lineRule="auto"/>
+        <w:rPr>
+          <w:rFonts w:eastAsia="Times New Roman" w:cs="Times New Roman"/>
+          <w:kern w:val="0"/>
+          <w:lang w:val="en-US" w:eastAsia="fr-LU"/>
+          <w14:ligatures w14:val="none"/>
+        </w:rPr>
+      </w:pPr>
+      <w:r>
+        <w:rPr>
+          <w:rFonts w:eastAsia="Times New Roman" w:cs="Times New Roman"/>
+          <w:kern w:val="0"/>
+          <w:lang w:val="en-US" w:eastAsia="fr-LU"/>
+          <w14:ligatures w14:val="none"/>
+        </w:rPr>
+        <w:t xml:space="preserve"> game_id</w:t>
+      </w:r>
+    </w:p>
+    <w:p>
+      <w:pPr>
+        <w:pStyle w:val="ListParagraph"/>
+        <w:numPr>
+          <w:ilvl w:val="0"/>
+          <w:numId w:val="10"/>
+        </w:numPr>
+        <w:spacing w:before="100" w:beforeAutospacing="1" w:after="100" w:afterAutospacing="1" w:line="240" w:lineRule="auto"/>
+        <w:rPr>
+          <w:rFonts w:eastAsia="Times New Roman" w:cs="Times New Roman"/>
+          <w:kern w:val="0"/>
+          <w:lang w:val="en-US" w:eastAsia="fr-LU"/>
+          <w14:ligatures w14:val="none"/>
+        </w:rPr>
+      </w:pPr>
+      <w:r>
+        <w:rPr>
+          <w:rFonts w:eastAsia="Times New Roman" w:cs="Times New Roman"/>
+          <w:kern w:val="0"/>
+          <w:lang w:val="en-US" w:eastAsia="fr-LU"/>
+          <w14:ligatures w14:val="none"/>
+        </w:rPr>
+        <w:t>home_team</w:t>
+      </w:r>
+    </w:p>
+    <w:p>
+      <w:pPr>
+        <w:pStyle w:val="ListParagraph"/>
+        <w:numPr>
+          <w:ilvl w:val="0"/>
+          <w:numId w:val="10"/>
+        </w:numPr>
+        <w:spacing w:before="100" w:beforeAutospacing="1" w:after="100" w:afterAutospacing="1" w:line="240" w:lineRule="auto"/>
+        <w:rPr>
+          <w:rFonts w:eastAsia="Times New Roman" w:cs="Times New Roman"/>
+          <w:kern w:val="0"/>
+          <w:lang w:val="en-US" w:eastAsia="fr-LU"/>
+          <w14:ligatures w14:val="none"/>
+        </w:rPr>
+      </w:pPr>
+      <w:r>
+        <w:rPr>
+          <w:rFonts w:eastAsia="Times New Roman" w:cs="Times New Roman"/>
+          <w:kern w:val="0"/>
+          <w:lang w:val="en-US" w:eastAsia="fr-LU"/>
+          <w14:ligatures w14:val="none"/>
+        </w:rPr>
+        <w:t>away_team</w:t>
+      </w:r>
+    </w:p>
+    <w:p>
+      <w:pPr>
+        <w:pStyle w:val="ListParagraph"/>
+        <w:numPr>
+          <w:ilvl w:val="0"/>
+          <w:numId w:val="10"/>
+        </w:numPr>
+        <w:spacing w:before="100" w:beforeAutospacing="1" w:after="100" w:afterAutospacing="1" w:line="240" w:lineRule="auto"/>
+        <w:rPr>
+          <w:rFonts w:eastAsia="Times New Roman" w:cs="Times New Roman"/>
+          <w:kern w:val="0"/>
+          <w:lang w:val="en-US" w:eastAsia="fr-LU"/>
+          <w14:ligatures w14:val="none"/>
+        </w:rPr>
+      </w:pPr>
+      <w:r>
+        <w:rPr>
+          <w:rFonts w:eastAsia="Times New Roman" w:cs="Times New Roman"/>
+          <w:kern w:val="0"/>
+          <w:lang w:val="en-US" w:eastAsia="fr-LU"/>
+          <w14:ligatures w14:val="none"/>
+        </w:rPr>
+        <w:t>home_conference</w:t>
+      </w:r>
+    </w:p>
+    <w:p>
+      <w:pPr>
+        <w:pStyle w:val="ListParagraph"/>
+        <w:numPr>
+          <w:ilvl w:val="0"/>
+          <w:numId w:val="10"/>
+        </w:numPr>
+        <w:spacing w:before="100" w:beforeAutospacing="1" w:after="100" w:afterAutospacing="1" w:line="240" w:lineRule="auto"/>
+        <w:rPr>
+          <w:rFonts w:eastAsia="Times New Roman" w:cs="Times New Roman"/>
+          <w:kern w:val="0"/>
+          <w:lang w:val="en-US" w:eastAsia="fr-LU"/>
+          <w14:ligatures w14:val="none"/>
+        </w:rPr>
+      </w:pPr>
+      <w:r>
+        <w:rPr>
+          <w:rFonts w:eastAsia="Times New Roman" w:cs="Times New Roman"/>
+          <w:kern w:val="0"/>
+          <w:lang w:val="en-US" w:eastAsia="fr-LU"/>
+          <w14:ligatures w14:val="none"/>
+        </w:rPr>
+        <w:t>away_conference</w:t>
+      </w:r>
+    </w:p>
+    <w:p>
+      <w:pPr>
+        <w:pStyle w:val="ListParagraph"/>
+        <w:numPr>
+          <w:ilvl w:val="0"/>
+          <w:numId w:val="10"/>
+        </w:numPr>
+        <w:spacing w:before="100" w:beforeAutospacing="1" w:after="100" w:afterAutospacing="1" w:line="240" w:lineRule="auto"/>
+        <w:rPr>
+          <w:rFonts w:eastAsia="Times New Roman" w:cs="Times New Roman"/>
+          <w:kern w:val="0"/>
+          <w:lang w:val="en-US" w:eastAsia="fr-LU"/>
+          <w14:ligatures w14:val="none"/>
+        </w:rPr>
+      </w:pPr>
+      <w:r>
+        <w:rPr>
+          <w:rFonts w:eastAsia="Times New Roman" w:cs="Times New Roman"/>
+          <w:kern w:val="0"/>
+          <w:lang w:val="en-US" w:eastAsia="fr-LU"/>
+          <w14:ligatures w14:val="none"/>
+        </w:rPr>
+        <w:t>home_points</w:t>
+      </w:r>
+    </w:p>
+    <w:p>
+      <w:pPr>
+        <w:pStyle w:val="ListParagraph"/>
+        <w:numPr>
+          <w:ilvl w:val="0"/>
+          <w:numId w:val="10"/>
+        </w:numPr>
+        <w:spacing w:before="100" w:beforeAutospacing="1" w:after="100" w:afterAutospacing="1" w:line="240" w:lineRule="auto"/>
+        <w:rPr>
+          <w:rFonts w:eastAsia="Times New Roman" w:cs="Times New Roman"/>
+          <w:kern w:val="0"/>
+          <w:lang w:val="en-US" w:eastAsia="fr-LU"/>
+          <w14:ligatures w14:val="none"/>
+        </w:rPr>
+      </w:pPr>
+      <w:r>
+        <w:rPr>
+          <w:rFonts w:eastAsia="Times New Roman" w:cs="Times New Roman"/>
+          <w:kern w:val="0"/>
+          <w:lang w:val="en-US" w:eastAsia="fr-LU"/>
+          <w14:ligatures w14:val="none"/>
+        </w:rPr>
+        <w:t>away_points</w:t>
+      </w:r>
+    </w:p>
+    <w:p>
+      <w:pPr>
+        <w:pStyle w:val="ListParagraph"/>
+        <w:numPr>
+          <w:ilvl w:val="0"/>
+          <w:numId w:val="10"/>
+        </w:numPr>
+        <w:spacing w:before="100" w:beforeAutospacing="1" w:after="100" w:afterAutospacing="1" w:line="240" w:lineRule="auto"/>
+        <w:rPr>
+          <w:rFonts w:eastAsia="Times New Roman" w:cs="Times New Roman"/>
+          <w:kern w:val="0"/>
+          <w:lang w:val="en-US" w:eastAsia="fr-LU"/>
+          <w14:ligatures w14:val="none"/>
+        </w:rPr>
+      </w:pPr>
+      <w:r>
+        <w:rPr>
+          <w:rFonts w:eastAsia="Times New Roman" w:cs="Times New Roman"/>
+          <w:kern w:val="0"/>
+          <w:lang w:val="en-US" w:eastAsia="fr-LU"/>
+          <w14:ligatures w14:val="none"/>
+        </w:rPr>
+        <w:t xml:space="preserve"> winner_conference</w:t>
+      </w:r>
+    </w:p>
+    <w:p>
+      <w:pPr>
+        <w:pStyle w:val="ListParagraph"/>
+        <w:numPr>
+          <w:ilvl w:val="0"/>
+          <w:numId w:val="10"/>
+        </w:numPr>
+        <w:spacing w:before="100" w:beforeAutospacing="1" w:after="100" w:afterAutospacing="1" w:line="240" w:lineRule="auto"/>
+        <w:rPr>
+          <w:rFonts w:eastAsia="Times New Roman" w:cs="Times New Roman"/>
+          <w:kern w:val="0"/>
+          <w:lang w:val="en-US" w:eastAsia="fr-LU"/>
+          <w14:ligatures w14:val="none"/>
+        </w:rPr>
+      </w:pPr>
+      <w:r>
+        <w:rPr>
+          <w:rFonts w:eastAsia="Times New Roman" w:cs="Times New Roman"/>
+          <w:kern w:val="0"/>
+          <w:lang w:val="en-US" w:eastAsia="fr-LU"/>
+          <w14:ligatures w14:val="none"/>
+        </w:rPr>
+        <w:t xml:space="preserve"> loser_conference</w:t>
+      </w:r>
+    </w:p>
+    <w:p>
+      <w:pPr>
+        <w:pStyle w:val="ListParagraph"/>
+        <w:numPr>
+          <w:ilvl w:val="0"/>
+          <w:numId w:val="10"/>
+        </w:numPr>
+        <w:spacing w:before="100" w:beforeAutospacing="1" w:after="100" w:afterAutospacing="1" w:line="240" w:lineRule="auto"/>
+        <w:rPr>
+          <w:rFonts w:eastAsia="Times New Roman" w:cs="Times New Roman"/>
+          <w:kern w:val="0"/>
+          <w:lang w:val="en-US" w:eastAsia="fr-LU"/>
+          <w14:ligatures w14:val="none"/>
+        </w:rPr>
+      </w:pPr>
+      <w:r>
+        <w:rPr>
+          <w:rFonts w:eastAsia="Times New Roman" w:cs="Times New Roman"/>
+          <w:kern w:val="0"/>
+          <w:lang w:val="en-US" w:eastAsia="fr-LU"/>
+          <w14:ligatures w14:val="none"/>
+        </w:rPr>
+        <w:t>M</w:t>
+      </w:r>
+      <w:r>
+        <w:rPr>
+          <w:rFonts w:eastAsia="Times New Roman" w:cs="Times New Roman"/>
+          <w:kern w:val="0"/>
+          <w:lang w:val="en-US" w:eastAsia="fr-LU"/>
+          <w14:ligatures w14:val="none"/>
+        </w:rPr>
+        <w:t>argin</w:t>
+      </w:r>
+    </w:p>
+    <w:p>
+      <w:pPr>
+        <w:pStyle w:val="ListParagraph"/>
+        <w:numPr>
+          <w:ilvl w:val="0"/>
+          <w:numId w:val="10"/>
+        </w:numPr>
+        <w:spacing w:before="100" w:beforeAutospacing="1" w:after="100" w:afterAutospacing="1" w:line="240" w:lineRule="auto"/>
+        <w:rPr>
+          <w:rFonts w:eastAsia="Times New Roman" w:cs="Times New Roman"/>
+          <w:kern w:val="0"/>
+          <w:lang w:val="en-US" w:eastAsia="fr-LU"/>
+          <w14:ligatures w14:val="none"/>
+        </w:rPr>
+      </w:pPr>
+      <w:r>
+        <w:rPr>
+          <w:rFonts w:eastAsia="Times New Roman" w:cs="Times New Roman"/>
+          <w:kern w:val="0"/>
+          <w:lang w:val="en-US" w:eastAsia="fr-LU"/>
+          <w14:ligatures w14:val="none"/>
+        </w:rPr>
+        <w:t>neutral_site</w:t>
+      </w:r>
+    </w:p>
+    <w:p>
+      <w:pPr>
+        <w:pStyle w:val="ListParagraph"/>
+        <w:numPr>
+          <w:ilvl w:val="0"/>
+          <w:numId w:val="10"/>
+        </w:numPr>
+        <w:spacing w:before="100" w:beforeAutospacing="1" w:after="100" w:afterAutospacing="1" w:line="240" w:lineRule="auto"/>
+        <w:rPr>
+          <w:rFonts w:eastAsia="Times New Roman" w:cs="Times New Roman"/>
+          <w:kern w:val="0"/>
+          <w:lang w:val="en-US" w:eastAsia="fr-LU"/>
+          <w14:ligatures w14:val="none"/>
+        </w:rPr>
+      </w:pPr>
+      <w:r>
+        <w:rPr>
+          <w:rFonts w:eastAsia="Times New Roman" w:cs="Times New Roman"/>
+          <w:kern w:val="0"/>
+          <w:lang w:val="en-US" w:eastAsia="fr-LU"/>
+          <w14:ligatures w14:val="none"/>
+        </w:rPr>
+        <w:t>is_bowl_game (optionnel)</w:t>
+      </w:r>
+    </w:p>
+    <w:p>
+      <w:pPr>
+        <w:pStyle w:val="ListParagraph"/>
+        <w:numPr>
+          <w:ilvl w:val="0"/>
+          <w:numId w:val="10"/>
+        </w:numPr>
+        <w:spacing w:before="100" w:beforeAutospacing="1" w:after="100" w:afterAutospacing="1" w:line="240" w:lineRule="auto"/>
+        <w:rPr>
+          <w:rFonts w:eastAsia="Times New Roman" w:cs="Times New Roman"/>
+          <w:kern w:val="0"/>
+          <w:lang w:val="en-US" w:eastAsia="fr-LU"/>
+          <w14:ligatures w14:val="none"/>
+        </w:rPr>
+      </w:pPr>
+      <w:r>
+        <w:rPr>
+          <w:rFonts w:eastAsia="Times New Roman" w:cs="Times New Roman"/>
+          <w:kern w:val="0"/>
+          <w:lang w:val="en-US" w:eastAsia="fr-LU"/>
+          <w14:ligatures w14:val="none"/>
+        </w:rPr>
+        <w:t>is_playoff_game (optionnel)</w:t>
+      </w:r>
+    </w:p>
+    <w:p>
+      <w:pPr>
+        <w:spacing w:before="100" w:beforeAutospacing="1" w:after="100" w:afterAutospacing="1" w:line="240" w:lineRule="auto"/>
+      </w:pPr>
+      <w:r>
+        <w:rPr>
+          <w:rFonts w:eastAsia="Times New Roman" w:cs="Times New Roman"/>
+          <w:kern w:val="0"/>
+          <w:lang w:eastAsia="fr-LU"/>
+          <w14:ligatures w14:val="none"/>
+        </w:rPr>
+        <w:t>Dans la conception de n</w:t>
+      </w:r>
+      <w:r>
+        <w:rPr>
+          <w:rFonts w:eastAsia="Times New Roman" w:cs="Times New Roman"/>
+          <w:kern w:val="0"/>
+          <w:lang w:eastAsia="fr-LU"/>
+          <w14:ligatures w14:val="none"/>
+        </w:rPr>
+        <w:t xml:space="preserve">otre </w:t>
+      </w:r>
+      <w:r>
+        <w:t>"</w:t>
+      </w:r>
+      <w:r>
+        <w:rPr>
+          <w:i/>
+          <w:iCs/>
+        </w:rPr>
+        <w:t>conference matchup</w:t>
+      </w:r>
+      <w:r>
+        <w:t>"</w:t>
+      </w:r>
+      <w:r>
+        <w:t xml:space="preserve"> nous avons découvert la conception des champs dérivés. </w:t>
+      </w:r>
+      <w:r>
+        <w:br/>
+        <w:t xml:space="preserve">La question qui s’impose est la suivante : </w:t>
+      </w:r>
+    </w:p>
+    <w:p>
+      <w:pPr>
+        <w:spacing w:before="100" w:beforeAutospacing="1" w:after="100" w:afterAutospacing="1" w:line="240" w:lineRule="auto"/>
+      </w:pPr>
+      <w:r>
+        <w:t xml:space="preserve">C’est quoi un "champ dérivé" ? </w:t>
+      </w:r>
+    </w:p>
+    <w:p>
+      <w:pPr>
+        <w:spacing w:before="100" w:beforeAutospacing="1" w:after="100" w:afterAutospacing="1" w:line="240" w:lineRule="auto"/>
+      </w:pPr>
+      <w:r>
+        <w:t>C’est une information qui n’existe pas directement dans les données brutes mais que nous récupérons nous même à partir d’autres champs.</w:t>
+      </w:r>
+    </w:p>
+    <w:p>
+      <w:pPr>
+        <w:spacing w:before="100" w:beforeAutospacing="1" w:after="100" w:afterAutospacing="1" w:line="240" w:lineRule="auto"/>
+      </w:pPr>
+      <w:r>
+        <w:t xml:space="preserve">Dans le cadre de cet exercice nous parlons des champs comme : </w:t>
+      </w:r>
+    </w:p>
+    <w:p>
+      <w:pPr>
+        <w:pStyle w:val="ListParagraph"/>
+        <w:numPr>
+          <w:ilvl w:val="0"/>
+          <w:numId w:val="10"/>
+        </w:numPr>
+        <w:spacing w:before="100" w:beforeAutospacing="1" w:after="100" w:afterAutospacing="1" w:line="240" w:lineRule="auto"/>
+      </w:pPr>
+      <w:r>
+        <w:t xml:space="preserve">winner_conference dérivé de </w:t>
+      </w:r>
+      <w:r>
+        <w:rPr>
+          <w:i/>
+          <w:iCs/>
+        </w:rPr>
+        <w:t>home_points</w:t>
+      </w:r>
+      <w:r>
+        <w:rPr>
+          <w:i/>
+          <w:iCs/>
+        </w:rPr>
+        <w:t xml:space="preserve"> , away_points</w:t>
+      </w:r>
+    </w:p>
+    <w:p>
+      <w:pPr>
+        <w:pStyle w:val="ListParagraph"/>
+        <w:numPr>
+          <w:ilvl w:val="0"/>
+          <w:numId w:val="10"/>
+        </w:numPr>
+        <w:spacing w:before="100" w:beforeAutospacing="1" w:after="100" w:afterAutospacing="1" w:line="240" w:lineRule="auto"/>
+      </w:pPr>
+      <w:r>
+        <w:t>loser_conference même logique de dériver</w:t>
+      </w:r>
+    </w:p>
+    <w:p>
+      <w:pPr>
+        <w:pStyle w:val="ListParagraph"/>
+        <w:numPr>
+          <w:ilvl w:val="0"/>
+          <w:numId w:val="10"/>
+        </w:numPr>
+        <w:spacing w:before="100" w:beforeAutospacing="1" w:after="100" w:afterAutospacing="1" w:line="240" w:lineRule="auto"/>
+        <w:rPr>
+          <w:lang w:val="en-US"/>
+        </w:rPr>
+      </w:pPr>
+      <w:r>
+        <w:rPr>
+          <w:lang w:val="en-US"/>
+        </w:rPr>
+        <w:t xml:space="preserve">margin </w:t>
+      </w:r>
+      <w:r>
+        <w:rPr>
+          <w:lang w:val="en-US"/>
+        </w:rPr>
+        <w:t xml:space="preserve"> à partir </w:t>
+      </w:r>
+      <w:r>
+        <w:rPr>
+          <w:i/>
+          <w:iCs/>
+          <w:lang w:val="en-US"/>
+        </w:rPr>
+        <w:t>margin = abs(home_points - away_points)</w:t>
+      </w:r>
+    </w:p>
+    <w:p>
+      <w:pPr>
+        <w:pStyle w:val="ListParagraph"/>
+        <w:numPr>
+          <w:ilvl w:val="0"/>
+          <w:numId w:val="10"/>
+        </w:numPr>
+        <w:spacing w:before="100" w:beforeAutospacing="1" w:after="100" w:afterAutospacing="1" w:line="240" w:lineRule="auto"/>
+        <w:rPr>
+          <w:i/>
+          <w:iCs/>
+        </w:rPr>
+      </w:pPr>
+      <w:r>
+        <w:t>is_bowl_game</w:t>
+      </w:r>
+      <w:r>
+        <w:t xml:space="preserve"> dérivé à</w:t>
+      </w:r>
+      <w:r>
+        <w:t xml:space="preserve"> partir de </w:t>
+      </w:r>
+      <w:r>
+        <w:rPr>
+          <w:i/>
+          <w:iCs/>
+        </w:rPr>
+        <w:t>season_type</w:t>
+      </w:r>
+      <w:r>
+        <w:rPr>
+          <w:i/>
+          <w:iCs/>
+        </w:rPr>
+        <w:t xml:space="preserve"> </w:t>
+      </w:r>
+      <w:r>
+        <w:t xml:space="preserve">ou du nom de match </w:t>
+      </w:r>
+      <w:r>
+        <w:rPr>
+          <w:i/>
+          <w:iCs/>
+        </w:rPr>
+        <w:t>(ex : “Rose Bowl”, “Sugar Bowl”)</w:t>
+      </w:r>
+    </w:p>
+    <w:p>
+      <w:pPr>
+        <w:pStyle w:val="ListParagraph"/>
+        <w:numPr>
+          <w:ilvl w:val="0"/>
+          <w:numId w:val="10"/>
+        </w:numPr>
+        <w:spacing w:before="100" w:beforeAutospacing="1" w:after="100" w:afterAutospacing="1" w:line="240" w:lineRule="auto"/>
+      </w:pPr>
+      <w:r>
+        <w:t>is_playoff_game</w:t>
+      </w:r>
+      <w:r>
+        <w:t xml:space="preserve"> rérivé à partir de season_type == "postseason" et du nom de match (CFP Semifinal, CFP Championship)</w:t>
+      </w:r>
+    </w:p>
+    <w:p>
+      <w:pPr>
+        <w:pStyle w:val="ListParagraph"/>
+        <w:spacing w:before="100" w:beforeAutospacing="1" w:after="100" w:afterAutospacing="1" w:line="240" w:lineRule="auto"/>
+      </w:pPr>
+    </w:p>
+    <w:p>
+      <w:pPr>
+        <w:spacing w:before="100" w:beforeAutospacing="1" w:after="100" w:afterAutospacing="1" w:line="240" w:lineRule="auto"/>
+        <w:ind w:left="360"/>
+      </w:pPr>
+    </w:p>
+    <w:p>
+      <w:pPr>
+        <w:spacing w:before="100" w:beforeAutospacing="1" w:after="100" w:afterAutospacing="1" w:line="240" w:lineRule="auto"/>
+      </w:pPr>
+    </w:p>
+    <w:p>
+      <w:pPr>
+        <w:spacing w:before="100" w:beforeAutospacing="1" w:after="100" w:afterAutospacing="1" w:line="240" w:lineRule="auto"/>
+        <w:rPr>
+          <w:rFonts w:eastAsia="Times New Roman" w:cs="Times New Roman"/>
+          <w:kern w:val="0"/>
+          <w:lang w:eastAsia="fr-LU"/>
+          <w14:ligatures w14:val="none"/>
+        </w:rPr>
+      </w:pPr>
+    </w:p>
+    <w:p/>
+    <w:p/>
     <w:p/>
     <w:p/>
     <w:p/>
@@ -14900,15 +17073,15 @@
         <v:path o:extrusionok="f" gradientshapeok="t" o:connecttype="rect"/>
         <o:lock v:ext="edit" aspectratio="t"/>
       </v:shapetype>
-      <v:shape id="_x0000_i1025" type="#_x0000_t75" style="width:11.4pt;height:11.4pt" o:bullet="t">
+      <v:shape id="_x0000_i1025" type="#_x0000_t75" style="width:11.5pt;height:11.5pt" o:bullet="t">
         <v:imagedata r:id="rId1" o:title="msoBE94"/>
       </v:shape>
     </w:pict>
   </w:numPicBullet>
   <w:numPicBullet w:numPicBulletId="1">
     <w:pict>
-      <v:shape id="_x0000_i1026" type="#_x0000_t75" style="width:11.4pt;height:11.4pt" o:bullet="t">
-        <v:imagedata r:id="rId2" o:title="mso7039"/>
+      <v:shape id="_x0000_i1026" type="#_x0000_t75" style="width:11.5pt;height:11.5pt" o:bullet="t">
+        <v:imagedata r:id="rId2" o:title="mso3943"/>
       </v:shape>
     </w:pict>
   </w:numPicBullet>
@@ -15177,6 +17350,95 @@
     </w:lvl>
   </w:abstractNum>
   <w:abstractNum w:abstractNumId="3" w15:restartNumberingAfterBreak="0">
+    <w:nsid w:val="0714455B"/>
+    <w:multiLevelType w:val="hybridMultilevel"/>
+    <w:tmpl w:val="F7A40A38"/>
+    <w:lvl w:ilvl="0" w:tplc="FFFFFFFF">
+      <w:start w:val="1"/>
+      <w:numFmt w:val="decimal"/>
+      <w:lvlText w:val="%1."/>
+      <w:lvlJc w:val="left"/>
+      <w:pPr>
+        <w:ind w:left="720" w:hanging="360"/>
+      </w:pPr>
+      <w:rPr>
+        <w:rFonts w:hint="default"/>
+      </w:rPr>
+    </w:lvl>
+    <w:lvl w:ilvl="1" w:tplc="FFFFFFFF" w:tentative="1">
+      <w:start w:val="1"/>
+      <w:numFmt w:val="lowerLetter"/>
+      <w:lvlText w:val="%2."/>
+      <w:lvlJc w:val="left"/>
+      <w:pPr>
+        <w:ind w:left="1440" w:hanging="360"/>
+      </w:pPr>
+    </w:lvl>
+    <w:lvl w:ilvl="2" w:tplc="FFFFFFFF" w:tentative="1">
+      <w:start w:val="1"/>
+      <w:numFmt w:val="lowerRoman"/>
+      <w:lvlText w:val="%3."/>
+      <w:lvlJc w:val="right"/>
+      <w:pPr>
+        <w:ind w:left="2160" w:hanging="180"/>
+      </w:pPr>
+    </w:lvl>
+    <w:lvl w:ilvl="3" w:tplc="FFFFFFFF" w:tentative="1">
+      <w:start w:val="1"/>
+      <w:numFmt w:val="decimal"/>
+      <w:lvlText w:val="%4."/>
+      <w:lvlJc w:val="left"/>
+      <w:pPr>
+        <w:ind w:left="2880" w:hanging="360"/>
+      </w:pPr>
+    </w:lvl>
+    <w:lvl w:ilvl="4" w:tplc="FFFFFFFF" w:tentative="1">
+      <w:start w:val="1"/>
+      <w:numFmt w:val="lowerLetter"/>
+      <w:lvlText w:val="%5."/>
+      <w:lvlJc w:val="left"/>
+      <w:pPr>
+        <w:ind w:left="3600" w:hanging="360"/>
+      </w:pPr>
+    </w:lvl>
+    <w:lvl w:ilvl="5" w:tplc="FFFFFFFF" w:tentative="1">
+      <w:start w:val="1"/>
+      <w:numFmt w:val="lowerRoman"/>
+      <w:lvlText w:val="%6."/>
+      <w:lvlJc w:val="right"/>
+      <w:pPr>
+        <w:ind w:left="4320" w:hanging="180"/>
+      </w:pPr>
+    </w:lvl>
+    <w:lvl w:ilvl="6" w:tplc="FFFFFFFF" w:tentative="1">
+      <w:start w:val="1"/>
+      <w:numFmt w:val="decimal"/>
+      <w:lvlText w:val="%7."/>
+      <w:lvlJc w:val="left"/>
+      <w:pPr>
+        <w:ind w:left="5040" w:hanging="360"/>
+      </w:pPr>
+    </w:lvl>
+    <w:lvl w:ilvl="7" w:tplc="FFFFFFFF" w:tentative="1">
+      <w:start w:val="1"/>
+      <w:numFmt w:val="lowerLetter"/>
+      <w:lvlText w:val="%8."/>
+      <w:lvlJc w:val="left"/>
+      <w:pPr>
+        <w:ind w:left="5760" w:hanging="360"/>
+      </w:pPr>
+    </w:lvl>
+    <w:lvl w:ilvl="8" w:tplc="FFFFFFFF" w:tentative="1">
+      <w:start w:val="1"/>
+      <w:numFmt w:val="lowerRoman"/>
+      <w:lvlText w:val="%9."/>
+      <w:lvlJc w:val="right"/>
+      <w:pPr>
+        <w:ind w:left="6480" w:hanging="180"/>
+      </w:pPr>
+    </w:lvl>
+  </w:abstractNum>
+  <w:abstractNum w:abstractNumId="4" w15:restartNumberingAfterBreak="0">
     <w:nsid w:val="077E1EC7"/>
     <w:multiLevelType w:val="hybridMultilevel"/>
     <w:tmpl w:val="2B26D6C2"/>
@@ -15290,7 +17552,7 @@
       </w:rPr>
     </w:lvl>
   </w:abstractNum>
-  <w:abstractNum w:abstractNumId="4" w15:restartNumberingAfterBreak="0">
+  <w:abstractNum w:abstractNumId="5" w15:restartNumberingAfterBreak="0">
     <w:nsid w:val="07F43CF5"/>
     <w:multiLevelType w:val="hybridMultilevel"/>
     <w:tmpl w:val="1850F91C"/>
@@ -15379,7 +17641,7 @@
       </w:pPr>
     </w:lvl>
   </w:abstractNum>
-  <w:abstractNum w:abstractNumId="5" w15:restartNumberingAfterBreak="0">
+  <w:abstractNum w:abstractNumId="6" w15:restartNumberingAfterBreak="0">
     <w:nsid w:val="09B75A12"/>
     <w:multiLevelType w:val="hybridMultilevel"/>
     <w:tmpl w:val="D7DA83C4"/>
@@ -15465,7 +17727,7 @@
       </w:pPr>
     </w:lvl>
   </w:abstractNum>
-  <w:abstractNum w:abstractNumId="6" w15:restartNumberingAfterBreak="0">
+  <w:abstractNum w:abstractNumId="7" w15:restartNumberingAfterBreak="0">
     <w:nsid w:val="0ADC3B80"/>
     <w:multiLevelType w:val="hybridMultilevel"/>
     <w:tmpl w:val="0E5AFC28"/>
@@ -15554,10 +17816,10 @@
       </w:pPr>
     </w:lvl>
   </w:abstractNum>
-  <w:abstractNum w:abstractNumId="7" w15:restartNumberingAfterBreak="0">
+  <w:abstractNum w:abstractNumId="8" w15:restartNumberingAfterBreak="0">
     <w:nsid w:val="0F7E0889"/>
     <w:multiLevelType w:val="hybridMultilevel"/>
-    <w:tmpl w:val="32DEFF92"/>
+    <w:tmpl w:val="160AD46E"/>
     <w:lvl w:ilvl="0" w:tplc="140C0007">
       <w:start w:val="1"/>
       <w:numFmt w:val="bullet"/>
@@ -15668,7 +17930,7 @@
       </w:rPr>
     </w:lvl>
   </w:abstractNum>
-  <w:abstractNum w:abstractNumId="8" w15:restartNumberingAfterBreak="0">
+  <w:abstractNum w:abstractNumId="9" w15:restartNumberingAfterBreak="0">
     <w:nsid w:val="140E0C79"/>
     <w:multiLevelType w:val="hybridMultilevel"/>
     <w:tmpl w:val="7C984EA2"/>
@@ -15782,7 +18044,7 @@
       </w:rPr>
     </w:lvl>
   </w:abstractNum>
-  <w:abstractNum w:abstractNumId="9" w15:restartNumberingAfterBreak="0">
+  <w:abstractNum w:abstractNumId="10" w15:restartNumberingAfterBreak="0">
     <w:nsid w:val="14FD55B5"/>
     <w:multiLevelType w:val="hybridMultilevel"/>
     <w:tmpl w:val="95B6F922"/>
@@ -15896,7 +18158,7 @@
       </w:rPr>
     </w:lvl>
   </w:abstractNum>
-  <w:abstractNum w:abstractNumId="10" w15:restartNumberingAfterBreak="0">
+  <w:abstractNum w:abstractNumId="11" w15:restartNumberingAfterBreak="0">
     <w:nsid w:val="177D3B1C"/>
     <w:multiLevelType w:val="hybridMultilevel"/>
     <w:tmpl w:val="E6944406"/>
@@ -15982,10 +18244,10 @@
       </w:pPr>
     </w:lvl>
   </w:abstractNum>
-  <w:abstractNum w:abstractNumId="11" w15:restartNumberingAfterBreak="0">
+  <w:abstractNum w:abstractNumId="12" w15:restartNumberingAfterBreak="0">
     <w:nsid w:val="18936E06"/>
     <w:multiLevelType w:val="hybridMultilevel"/>
-    <w:tmpl w:val="DE68DC2C"/>
+    <w:tmpl w:val="E50A780E"/>
     <w:lvl w:ilvl="0" w:tplc="140C000F">
       <w:start w:val="1"/>
       <w:numFmt w:val="decimal"/>
@@ -16071,7 +18333,7 @@
       </w:pPr>
     </w:lvl>
   </w:abstractNum>
-  <w:abstractNum w:abstractNumId="12" w15:restartNumberingAfterBreak="0">
+  <w:abstractNum w:abstractNumId="13" w15:restartNumberingAfterBreak="0">
     <w:nsid w:val="1B9F618C"/>
     <w:multiLevelType w:val="hybridMultilevel"/>
     <w:tmpl w:val="FDCACC56"/>
@@ -16185,7 +18447,7 @@
       </w:rPr>
     </w:lvl>
   </w:abstractNum>
-  <w:abstractNum w:abstractNumId="13" w15:restartNumberingAfterBreak="0">
+  <w:abstractNum w:abstractNumId="14" w15:restartNumberingAfterBreak="0">
     <w:nsid w:val="1CB877CA"/>
     <w:multiLevelType w:val="hybridMultilevel"/>
     <w:tmpl w:val="C06EF67A"/>
@@ -16299,7 +18561,7 @@
       </w:rPr>
     </w:lvl>
   </w:abstractNum>
-  <w:abstractNum w:abstractNumId="14" w15:restartNumberingAfterBreak="0">
+  <w:abstractNum w:abstractNumId="15" w15:restartNumberingAfterBreak="0">
     <w:nsid w:val="20B91445"/>
     <w:multiLevelType w:val="hybridMultilevel"/>
     <w:tmpl w:val="06A67810"/>
@@ -16385,7 +18647,96 @@
       </w:pPr>
     </w:lvl>
   </w:abstractNum>
-  <w:abstractNum w:abstractNumId="15" w15:restartNumberingAfterBreak="0">
+  <w:abstractNum w:abstractNumId="16" w15:restartNumberingAfterBreak="0">
+    <w:nsid w:val="20C96C4C"/>
+    <w:multiLevelType w:val="hybridMultilevel"/>
+    <w:tmpl w:val="2254629C"/>
+    <w:lvl w:ilvl="0" w:tplc="140C000F">
+      <w:start w:val="1"/>
+      <w:numFmt w:val="decimal"/>
+      <w:lvlText w:val="%1."/>
+      <w:lvlJc w:val="left"/>
+      <w:pPr>
+        <w:ind w:left="720" w:hanging="360"/>
+      </w:pPr>
+      <w:rPr>
+        <w:rFonts w:hint="default"/>
+      </w:rPr>
+    </w:lvl>
+    <w:lvl w:ilvl="1" w:tplc="140C0019" w:tentative="1">
+      <w:start w:val="1"/>
+      <w:numFmt w:val="lowerLetter"/>
+      <w:lvlText w:val="%2."/>
+      <w:lvlJc w:val="left"/>
+      <w:pPr>
+        <w:ind w:left="1440" w:hanging="360"/>
+      </w:pPr>
+    </w:lvl>
+    <w:lvl w:ilvl="2" w:tplc="140C001B" w:tentative="1">
+      <w:start w:val="1"/>
+      <w:numFmt w:val="lowerRoman"/>
+      <w:lvlText w:val="%3."/>
+      <w:lvlJc w:val="right"/>
+      <w:pPr>
+        <w:ind w:left="2160" w:hanging="180"/>
+      </w:pPr>
+    </w:lvl>
+    <w:lvl w:ilvl="3" w:tplc="140C000F" w:tentative="1">
+      <w:start w:val="1"/>
+      <w:numFmt w:val="decimal"/>
+      <w:lvlText w:val="%4."/>
+      <w:lvlJc w:val="left"/>
+      <w:pPr>
+        <w:ind w:left="2880" w:hanging="360"/>
+      </w:pPr>
+    </w:lvl>
+    <w:lvl w:ilvl="4" w:tplc="140C0019" w:tentative="1">
+      <w:start w:val="1"/>
+      <w:numFmt w:val="lowerLetter"/>
+      <w:lvlText w:val="%5."/>
+      <w:lvlJc w:val="left"/>
+      <w:pPr>
+        <w:ind w:left="3600" w:hanging="360"/>
+      </w:pPr>
+    </w:lvl>
+    <w:lvl w:ilvl="5" w:tplc="140C001B" w:tentative="1">
+      <w:start w:val="1"/>
+      <w:numFmt w:val="lowerRoman"/>
+      <w:lvlText w:val="%6."/>
+      <w:lvlJc w:val="right"/>
+      <w:pPr>
+        <w:ind w:left="4320" w:hanging="180"/>
+      </w:pPr>
+    </w:lvl>
+    <w:lvl w:ilvl="6" w:tplc="140C000F" w:tentative="1">
+      <w:start w:val="1"/>
+      <w:numFmt w:val="decimal"/>
+      <w:lvlText w:val="%7."/>
+      <w:lvlJc w:val="left"/>
+      <w:pPr>
+        <w:ind w:left="5040" w:hanging="360"/>
+      </w:pPr>
+    </w:lvl>
+    <w:lvl w:ilvl="7" w:tplc="140C0019" w:tentative="1">
+      <w:start w:val="1"/>
+      <w:numFmt w:val="lowerLetter"/>
+      <w:lvlText w:val="%8."/>
+      <w:lvlJc w:val="left"/>
+      <w:pPr>
+        <w:ind w:left="5760" w:hanging="360"/>
+      </w:pPr>
+    </w:lvl>
+    <w:lvl w:ilvl="8" w:tplc="140C001B" w:tentative="1">
+      <w:start w:val="1"/>
+      <w:numFmt w:val="lowerRoman"/>
+      <w:lvlText w:val="%9."/>
+      <w:lvlJc w:val="right"/>
+      <w:pPr>
+        <w:ind w:left="6480" w:hanging="180"/>
+      </w:pPr>
+    </w:lvl>
+  </w:abstractNum>
+  <w:abstractNum w:abstractNumId="17" w15:restartNumberingAfterBreak="0">
     <w:nsid w:val="212302D3"/>
     <w:multiLevelType w:val="multilevel"/>
     <w:tmpl w:val="140C0021"/>
@@ -16498,7 +18849,7 @@
       </w:rPr>
     </w:lvl>
   </w:abstractNum>
-  <w:abstractNum w:abstractNumId="16" w15:restartNumberingAfterBreak="0">
+  <w:abstractNum w:abstractNumId="18" w15:restartNumberingAfterBreak="0">
     <w:nsid w:val="213F1902"/>
     <w:multiLevelType w:val="hybridMultilevel"/>
     <w:tmpl w:val="3C18EC0A"/>
@@ -16612,7 +18963,7 @@
       </w:rPr>
     </w:lvl>
   </w:abstractNum>
-  <w:abstractNum w:abstractNumId="17" w15:restartNumberingAfterBreak="0">
+  <w:abstractNum w:abstractNumId="19" w15:restartNumberingAfterBreak="0">
     <w:nsid w:val="240A49DF"/>
     <w:multiLevelType w:val="hybridMultilevel"/>
     <w:tmpl w:val="3A30CBBA"/>
@@ -16701,7 +19052,7 @@
       </w:pPr>
     </w:lvl>
   </w:abstractNum>
-  <w:abstractNum w:abstractNumId="18" w15:restartNumberingAfterBreak="0">
+  <w:abstractNum w:abstractNumId="20" w15:restartNumberingAfterBreak="0">
     <w:nsid w:val="25C65457"/>
     <w:multiLevelType w:val="hybridMultilevel"/>
     <w:tmpl w:val="ACC6A720"/>
@@ -16790,7 +19141,7 @@
       </w:pPr>
     </w:lvl>
   </w:abstractNum>
-  <w:abstractNum w:abstractNumId="19" w15:restartNumberingAfterBreak="0">
+  <w:abstractNum w:abstractNumId="21" w15:restartNumberingAfterBreak="0">
     <w:nsid w:val="27440CD8"/>
     <w:multiLevelType w:val="hybridMultilevel"/>
     <w:tmpl w:val="21ECC68A"/>
@@ -16879,7 +19230,96 @@
       </w:pPr>
     </w:lvl>
   </w:abstractNum>
-  <w:abstractNum w:abstractNumId="20" w15:restartNumberingAfterBreak="0">
+  <w:abstractNum w:abstractNumId="22" w15:restartNumberingAfterBreak="0">
+    <w:nsid w:val="29607964"/>
+    <w:multiLevelType w:val="hybridMultilevel"/>
+    <w:tmpl w:val="BCD49162"/>
+    <w:lvl w:ilvl="0" w:tplc="140C000F">
+      <w:start w:val="1"/>
+      <w:numFmt w:val="decimal"/>
+      <w:lvlText w:val="%1."/>
+      <w:lvlJc w:val="left"/>
+      <w:pPr>
+        <w:ind w:left="720" w:hanging="360"/>
+      </w:pPr>
+      <w:rPr>
+        <w:rFonts w:hint="default"/>
+      </w:rPr>
+    </w:lvl>
+    <w:lvl w:ilvl="1" w:tplc="140C0019" w:tentative="1">
+      <w:start w:val="1"/>
+      <w:numFmt w:val="lowerLetter"/>
+      <w:lvlText w:val="%2."/>
+      <w:lvlJc w:val="left"/>
+      <w:pPr>
+        <w:ind w:left="1440" w:hanging="360"/>
+      </w:pPr>
+    </w:lvl>
+    <w:lvl w:ilvl="2" w:tplc="140C001B" w:tentative="1">
+      <w:start w:val="1"/>
+      <w:numFmt w:val="lowerRoman"/>
+      <w:lvlText w:val="%3."/>
+      <w:lvlJc w:val="right"/>
+      <w:pPr>
+        <w:ind w:left="2160" w:hanging="180"/>
+      </w:pPr>
+    </w:lvl>
+    <w:lvl w:ilvl="3" w:tplc="140C000F" w:tentative="1">
+      <w:start w:val="1"/>
+      <w:numFmt w:val="decimal"/>
+      <w:lvlText w:val="%4."/>
+      <w:lvlJc w:val="left"/>
+      <w:pPr>
+        <w:ind w:left="2880" w:hanging="360"/>
+      </w:pPr>
+    </w:lvl>
+    <w:lvl w:ilvl="4" w:tplc="140C0019" w:tentative="1">
+      <w:start w:val="1"/>
+      <w:numFmt w:val="lowerLetter"/>
+      <w:lvlText w:val="%5."/>
+      <w:lvlJc w:val="left"/>
+      <w:pPr>
+        <w:ind w:left="3600" w:hanging="360"/>
+      </w:pPr>
+    </w:lvl>
+    <w:lvl w:ilvl="5" w:tplc="140C001B" w:tentative="1">
+      <w:start w:val="1"/>
+      <w:numFmt w:val="lowerRoman"/>
+      <w:lvlText w:val="%6."/>
+      <w:lvlJc w:val="right"/>
+      <w:pPr>
+        <w:ind w:left="4320" w:hanging="180"/>
+      </w:pPr>
+    </w:lvl>
+    <w:lvl w:ilvl="6" w:tplc="140C000F" w:tentative="1">
+      <w:start w:val="1"/>
+      <w:numFmt w:val="decimal"/>
+      <w:lvlText w:val="%7."/>
+      <w:lvlJc w:val="left"/>
+      <w:pPr>
+        <w:ind w:left="5040" w:hanging="360"/>
+      </w:pPr>
+    </w:lvl>
+    <w:lvl w:ilvl="7" w:tplc="140C0019" w:tentative="1">
+      <w:start w:val="1"/>
+      <w:numFmt w:val="lowerLetter"/>
+      <w:lvlText w:val="%8."/>
+      <w:lvlJc w:val="left"/>
+      <w:pPr>
+        <w:ind w:left="5760" w:hanging="360"/>
+      </w:pPr>
+    </w:lvl>
+    <w:lvl w:ilvl="8" w:tplc="140C001B" w:tentative="1">
+      <w:start w:val="1"/>
+      <w:numFmt w:val="lowerRoman"/>
+      <w:lvlText w:val="%9."/>
+      <w:lvlJc w:val="right"/>
+      <w:pPr>
+        <w:ind w:left="6480" w:hanging="180"/>
+      </w:pPr>
+    </w:lvl>
+  </w:abstractNum>
+  <w:abstractNum w:abstractNumId="23" w15:restartNumberingAfterBreak="0">
     <w:nsid w:val="29A55D10"/>
     <w:multiLevelType w:val="hybridMultilevel"/>
     <w:tmpl w:val="C9A2EF0E"/>
@@ -16968,7 +19408,7 @@
       </w:pPr>
     </w:lvl>
   </w:abstractNum>
-  <w:abstractNum w:abstractNumId="21" w15:restartNumberingAfterBreak="0">
+  <w:abstractNum w:abstractNumId="24" w15:restartNumberingAfterBreak="0">
     <w:nsid w:val="29C52175"/>
     <w:multiLevelType w:val="hybridMultilevel"/>
     <w:tmpl w:val="84ECCE50"/>
@@ -17054,7 +19494,7 @@
       </w:pPr>
     </w:lvl>
   </w:abstractNum>
-  <w:abstractNum w:abstractNumId="22" w15:restartNumberingAfterBreak="0">
+  <w:abstractNum w:abstractNumId="25" w15:restartNumberingAfterBreak="0">
     <w:nsid w:val="2C934DFB"/>
     <w:multiLevelType w:val="hybridMultilevel"/>
     <w:tmpl w:val="38C418F2"/>
@@ -17143,7 +19583,7 @@
       </w:pPr>
     </w:lvl>
   </w:abstractNum>
-  <w:abstractNum w:abstractNumId="23" w15:restartNumberingAfterBreak="0">
+  <w:abstractNum w:abstractNumId="26" w15:restartNumberingAfterBreak="0">
     <w:nsid w:val="2D1E1225"/>
     <w:multiLevelType w:val="hybridMultilevel"/>
     <w:tmpl w:val="A5903022"/>
@@ -17229,7 +19669,7 @@
       </w:pPr>
     </w:lvl>
   </w:abstractNum>
-  <w:abstractNum w:abstractNumId="24" w15:restartNumberingAfterBreak="0">
+  <w:abstractNum w:abstractNumId="27" w15:restartNumberingAfterBreak="0">
     <w:nsid w:val="2DA72D0A"/>
     <w:multiLevelType w:val="hybridMultilevel"/>
     <w:tmpl w:val="0DF24DBC"/>
@@ -17343,7 +19783,7 @@
       </w:rPr>
     </w:lvl>
   </w:abstractNum>
-  <w:abstractNum w:abstractNumId="25" w15:restartNumberingAfterBreak="0">
+  <w:abstractNum w:abstractNumId="28" w15:restartNumberingAfterBreak="0">
     <w:nsid w:val="2FED4F3A"/>
     <w:multiLevelType w:val="hybridMultilevel"/>
     <w:tmpl w:val="FC8E8A3E"/>
@@ -17432,7 +19872,7 @@
       </w:pPr>
     </w:lvl>
   </w:abstractNum>
-  <w:abstractNum w:abstractNumId="26" w15:restartNumberingAfterBreak="0">
+  <w:abstractNum w:abstractNumId="29" w15:restartNumberingAfterBreak="0">
     <w:nsid w:val="343C1413"/>
     <w:multiLevelType w:val="hybridMultilevel"/>
     <w:tmpl w:val="9E0004BC"/>
@@ -17546,7 +19986,7 @@
       </w:rPr>
     </w:lvl>
   </w:abstractNum>
-  <w:abstractNum w:abstractNumId="27" w15:restartNumberingAfterBreak="0">
+  <w:abstractNum w:abstractNumId="30" w15:restartNumberingAfterBreak="0">
     <w:nsid w:val="3522145D"/>
     <w:multiLevelType w:val="hybridMultilevel"/>
     <w:tmpl w:val="C846DCDA"/>
@@ -17660,7 +20100,7 @@
       </w:rPr>
     </w:lvl>
   </w:abstractNum>
-  <w:abstractNum w:abstractNumId="28" w15:restartNumberingAfterBreak="0">
+  <w:abstractNum w:abstractNumId="31" w15:restartNumberingAfterBreak="0">
     <w:nsid w:val="364E1698"/>
     <w:multiLevelType w:val="hybridMultilevel"/>
     <w:tmpl w:val="B7FE3BE8"/>
@@ -17749,10 +20189,10 @@
       </w:pPr>
     </w:lvl>
   </w:abstractNum>
-  <w:abstractNum w:abstractNumId="29" w15:restartNumberingAfterBreak="0">
+  <w:abstractNum w:abstractNumId="32" w15:restartNumberingAfterBreak="0">
     <w:nsid w:val="370152EE"/>
     <w:multiLevelType w:val="hybridMultilevel"/>
-    <w:tmpl w:val="4A1EF2AC"/>
+    <w:tmpl w:val="7542D696"/>
     <w:lvl w:ilvl="0" w:tplc="48D0C312">
       <w:numFmt w:val="bullet"/>
       <w:lvlText w:val="-"/>
@@ -17861,7 +20301,7 @@
       </w:rPr>
     </w:lvl>
   </w:abstractNum>
-  <w:abstractNum w:abstractNumId="30" w15:restartNumberingAfterBreak="0">
+  <w:abstractNum w:abstractNumId="33" w15:restartNumberingAfterBreak="0">
     <w:nsid w:val="38683C0D"/>
     <w:multiLevelType w:val="hybridMultilevel"/>
     <w:tmpl w:val="D7DA83C4"/>
@@ -17947,7 +20387,7 @@
       </w:pPr>
     </w:lvl>
   </w:abstractNum>
-  <w:abstractNum w:abstractNumId="31" w15:restartNumberingAfterBreak="0">
+  <w:abstractNum w:abstractNumId="34" w15:restartNumberingAfterBreak="0">
     <w:nsid w:val="386A6862"/>
     <w:multiLevelType w:val="hybridMultilevel"/>
     <w:tmpl w:val="A2B21F08"/>
@@ -18036,7 +20476,7 @@
       </w:pPr>
     </w:lvl>
   </w:abstractNum>
-  <w:abstractNum w:abstractNumId="32" w15:restartNumberingAfterBreak="0">
+  <w:abstractNum w:abstractNumId="35" w15:restartNumberingAfterBreak="0">
     <w:nsid w:val="39757A3B"/>
     <w:multiLevelType w:val="hybridMultilevel"/>
     <w:tmpl w:val="A9BAEF50"/>
@@ -18125,7 +20565,7 @@
       </w:pPr>
     </w:lvl>
   </w:abstractNum>
-  <w:abstractNum w:abstractNumId="33" w15:restartNumberingAfterBreak="0">
+  <w:abstractNum w:abstractNumId="36" w15:restartNumberingAfterBreak="0">
     <w:nsid w:val="3AA916B1"/>
     <w:multiLevelType w:val="hybridMultilevel"/>
     <w:tmpl w:val="1EC84B68"/>
@@ -18214,7 +20654,7 @@
       </w:pPr>
     </w:lvl>
   </w:abstractNum>
-  <w:abstractNum w:abstractNumId="34" w15:restartNumberingAfterBreak="0">
+  <w:abstractNum w:abstractNumId="37" w15:restartNumberingAfterBreak="0">
     <w:nsid w:val="3D581BAD"/>
     <w:multiLevelType w:val="hybridMultilevel"/>
     <w:tmpl w:val="E40058E4"/>
@@ -18300,7 +20740,7 @@
       </w:pPr>
     </w:lvl>
   </w:abstractNum>
-  <w:abstractNum w:abstractNumId="35" w15:restartNumberingAfterBreak="0">
+  <w:abstractNum w:abstractNumId="38" w15:restartNumberingAfterBreak="0">
     <w:nsid w:val="3DD13C69"/>
     <w:multiLevelType w:val="hybridMultilevel"/>
     <w:tmpl w:val="B734F20C"/>
@@ -18389,7 +20829,7 @@
       </w:pPr>
     </w:lvl>
   </w:abstractNum>
-  <w:abstractNum w:abstractNumId="36" w15:restartNumberingAfterBreak="0">
+  <w:abstractNum w:abstractNumId="39" w15:restartNumberingAfterBreak="0">
     <w:nsid w:val="3FC80B3A"/>
     <w:multiLevelType w:val="hybridMultilevel"/>
     <w:tmpl w:val="464682F8"/>
@@ -18503,7 +20943,7 @@
       </w:rPr>
     </w:lvl>
   </w:abstractNum>
-  <w:abstractNum w:abstractNumId="37" w15:restartNumberingAfterBreak="0">
+  <w:abstractNum w:abstractNumId="40" w15:restartNumberingAfterBreak="0">
     <w:nsid w:val="418143AB"/>
     <w:multiLevelType w:val="hybridMultilevel"/>
     <w:tmpl w:val="4F56F242"/>
@@ -18617,7 +21057,7 @@
       </w:rPr>
     </w:lvl>
   </w:abstractNum>
-  <w:abstractNum w:abstractNumId="38" w15:restartNumberingAfterBreak="0">
+  <w:abstractNum w:abstractNumId="41" w15:restartNumberingAfterBreak="0">
     <w:nsid w:val="42451735"/>
     <w:multiLevelType w:val="hybridMultilevel"/>
     <w:tmpl w:val="1E32DCDC"/>
@@ -18703,7 +21143,96 @@
       </w:pPr>
     </w:lvl>
   </w:abstractNum>
-  <w:abstractNum w:abstractNumId="39" w15:restartNumberingAfterBreak="0">
+  <w:abstractNum w:abstractNumId="42" w15:restartNumberingAfterBreak="0">
+    <w:nsid w:val="430C772D"/>
+    <w:multiLevelType w:val="hybridMultilevel"/>
+    <w:tmpl w:val="02747C12"/>
+    <w:lvl w:ilvl="0" w:tplc="140C000F">
+      <w:start w:val="1"/>
+      <w:numFmt w:val="decimal"/>
+      <w:lvlText w:val="%1."/>
+      <w:lvlJc w:val="left"/>
+      <w:pPr>
+        <w:ind w:left="720" w:hanging="360"/>
+      </w:pPr>
+      <w:rPr>
+        <w:rFonts w:hint="default"/>
+      </w:rPr>
+    </w:lvl>
+    <w:lvl w:ilvl="1" w:tplc="140C0019" w:tentative="1">
+      <w:start w:val="1"/>
+      <w:numFmt w:val="lowerLetter"/>
+      <w:lvlText w:val="%2."/>
+      <w:lvlJc w:val="left"/>
+      <w:pPr>
+        <w:ind w:left="1440" w:hanging="360"/>
+      </w:pPr>
+    </w:lvl>
+    <w:lvl w:ilvl="2" w:tplc="140C001B" w:tentative="1">
+      <w:start w:val="1"/>
+      <w:numFmt w:val="lowerRoman"/>
+      <w:lvlText w:val="%3."/>
+      <w:lvlJc w:val="right"/>
+      <w:pPr>
+        <w:ind w:left="2160" w:hanging="180"/>
+      </w:pPr>
+    </w:lvl>
+    <w:lvl w:ilvl="3" w:tplc="140C000F" w:tentative="1">
+      <w:start w:val="1"/>
+      <w:numFmt w:val="decimal"/>
+      <w:lvlText w:val="%4."/>
+      <w:lvlJc w:val="left"/>
+      <w:pPr>
+        <w:ind w:left="2880" w:hanging="360"/>
+      </w:pPr>
+    </w:lvl>
+    <w:lvl w:ilvl="4" w:tplc="140C0019" w:tentative="1">
+      <w:start w:val="1"/>
+      <w:numFmt w:val="lowerLetter"/>
+      <w:lvlText w:val="%5."/>
+      <w:lvlJc w:val="left"/>
+      <w:pPr>
+        <w:ind w:left="3600" w:hanging="360"/>
+      </w:pPr>
+    </w:lvl>
+    <w:lvl w:ilvl="5" w:tplc="140C001B" w:tentative="1">
+      <w:start w:val="1"/>
+      <w:numFmt w:val="lowerRoman"/>
+      <w:lvlText w:val="%6."/>
+      <w:lvlJc w:val="right"/>
+      <w:pPr>
+        <w:ind w:left="4320" w:hanging="180"/>
+      </w:pPr>
+    </w:lvl>
+    <w:lvl w:ilvl="6" w:tplc="140C000F" w:tentative="1">
+      <w:start w:val="1"/>
+      <w:numFmt w:val="decimal"/>
+      <w:lvlText w:val="%7."/>
+      <w:lvlJc w:val="left"/>
+      <w:pPr>
+        <w:ind w:left="5040" w:hanging="360"/>
+      </w:pPr>
+    </w:lvl>
+    <w:lvl w:ilvl="7" w:tplc="140C0019" w:tentative="1">
+      <w:start w:val="1"/>
+      <w:numFmt w:val="lowerLetter"/>
+      <w:lvlText w:val="%8."/>
+      <w:lvlJc w:val="left"/>
+      <w:pPr>
+        <w:ind w:left="5760" w:hanging="360"/>
+      </w:pPr>
+    </w:lvl>
+    <w:lvl w:ilvl="8" w:tplc="140C001B" w:tentative="1">
+      <w:start w:val="1"/>
+      <w:numFmt w:val="lowerRoman"/>
+      <w:lvlText w:val="%9."/>
+      <w:lvlJc w:val="right"/>
+      <w:pPr>
+        <w:ind w:left="6480" w:hanging="180"/>
+      </w:pPr>
+    </w:lvl>
+  </w:abstractNum>
+  <w:abstractNum w:abstractNumId="43" w15:restartNumberingAfterBreak="0">
     <w:nsid w:val="43747FCA"/>
     <w:multiLevelType w:val="hybridMultilevel"/>
     <w:tmpl w:val="63063C46"/>
@@ -18792,7 +21321,7 @@
       </w:pPr>
     </w:lvl>
   </w:abstractNum>
-  <w:abstractNum w:abstractNumId="40" w15:restartNumberingAfterBreak="0">
+  <w:abstractNum w:abstractNumId="44" w15:restartNumberingAfterBreak="0">
     <w:nsid w:val="44EB40B0"/>
     <w:multiLevelType w:val="multilevel"/>
     <w:tmpl w:val="E8E409B6"/>
@@ -18941,7 +21470,96 @@
       </w:rPr>
     </w:lvl>
   </w:abstractNum>
-  <w:abstractNum w:abstractNumId="41" w15:restartNumberingAfterBreak="0">
+  <w:abstractNum w:abstractNumId="45" w15:restartNumberingAfterBreak="0">
+    <w:nsid w:val="48621D53"/>
+    <w:multiLevelType w:val="hybridMultilevel"/>
+    <w:tmpl w:val="639EFB2E"/>
+    <w:lvl w:ilvl="0" w:tplc="140C000F">
+      <w:start w:val="1"/>
+      <w:numFmt w:val="decimal"/>
+      <w:lvlText w:val="%1."/>
+      <w:lvlJc w:val="left"/>
+      <w:pPr>
+        <w:ind w:left="720" w:hanging="360"/>
+      </w:pPr>
+      <w:rPr>
+        <w:rFonts w:hint="default"/>
+      </w:rPr>
+    </w:lvl>
+    <w:lvl w:ilvl="1" w:tplc="140C0019" w:tentative="1">
+      <w:start w:val="1"/>
+      <w:numFmt w:val="lowerLetter"/>
+      <w:lvlText w:val="%2."/>
+      <w:lvlJc w:val="left"/>
+      <w:pPr>
+        <w:ind w:left="1440" w:hanging="360"/>
+      </w:pPr>
+    </w:lvl>
+    <w:lvl w:ilvl="2" w:tplc="140C001B" w:tentative="1">
+      <w:start w:val="1"/>
+      <w:numFmt w:val="lowerRoman"/>
+      <w:lvlText w:val="%3."/>
+      <w:lvlJc w:val="right"/>
+      <w:pPr>
+        <w:ind w:left="2160" w:hanging="180"/>
+      </w:pPr>
+    </w:lvl>
+    <w:lvl w:ilvl="3" w:tplc="140C000F" w:tentative="1">
+      <w:start w:val="1"/>
+      <w:numFmt w:val="decimal"/>
+      <w:lvlText w:val="%4."/>
+      <w:lvlJc w:val="left"/>
+      <w:pPr>
+        <w:ind w:left="2880" w:hanging="360"/>
+      </w:pPr>
+    </w:lvl>
+    <w:lvl w:ilvl="4" w:tplc="140C0019" w:tentative="1">
+      <w:start w:val="1"/>
+      <w:numFmt w:val="lowerLetter"/>
+      <w:lvlText w:val="%5."/>
+      <w:lvlJc w:val="left"/>
+      <w:pPr>
+        <w:ind w:left="3600" w:hanging="360"/>
+      </w:pPr>
+    </w:lvl>
+    <w:lvl w:ilvl="5" w:tplc="140C001B" w:tentative="1">
+      <w:start w:val="1"/>
+      <w:numFmt w:val="lowerRoman"/>
+      <w:lvlText w:val="%6."/>
+      <w:lvlJc w:val="right"/>
+      <w:pPr>
+        <w:ind w:left="4320" w:hanging="180"/>
+      </w:pPr>
+    </w:lvl>
+    <w:lvl w:ilvl="6" w:tplc="140C000F" w:tentative="1">
+      <w:start w:val="1"/>
+      <w:numFmt w:val="decimal"/>
+      <w:lvlText w:val="%7."/>
+      <w:lvlJc w:val="left"/>
+      <w:pPr>
+        <w:ind w:left="5040" w:hanging="360"/>
+      </w:pPr>
+    </w:lvl>
+    <w:lvl w:ilvl="7" w:tplc="140C0019" w:tentative="1">
+      <w:start w:val="1"/>
+      <w:numFmt w:val="lowerLetter"/>
+      <w:lvlText w:val="%8."/>
+      <w:lvlJc w:val="left"/>
+      <w:pPr>
+        <w:ind w:left="5760" w:hanging="360"/>
+      </w:pPr>
+    </w:lvl>
+    <w:lvl w:ilvl="8" w:tplc="140C001B" w:tentative="1">
+      <w:start w:val="1"/>
+      <w:numFmt w:val="lowerRoman"/>
+      <w:lvlText w:val="%9."/>
+      <w:lvlJc w:val="right"/>
+      <w:pPr>
+        <w:ind w:left="6480" w:hanging="180"/>
+      </w:pPr>
+    </w:lvl>
+  </w:abstractNum>
+  <w:abstractNum w:abstractNumId="46" w15:restartNumberingAfterBreak="0">
     <w:nsid w:val="493B112F"/>
     <w:multiLevelType w:val="hybridMultilevel"/>
     <w:tmpl w:val="EE20D1B0"/>
@@ -19055,7 +21673,7 @@
       </w:rPr>
     </w:lvl>
   </w:abstractNum>
-  <w:abstractNum w:abstractNumId="42" w15:restartNumberingAfterBreak="0">
+  <w:abstractNum w:abstractNumId="47" w15:restartNumberingAfterBreak="0">
     <w:nsid w:val="49546DBB"/>
     <w:multiLevelType w:val="hybridMultilevel"/>
     <w:tmpl w:val="D8C45F84"/>
@@ -19144,7 +21762,7 @@
       </w:pPr>
     </w:lvl>
   </w:abstractNum>
-  <w:abstractNum w:abstractNumId="43" w15:restartNumberingAfterBreak="0">
+  <w:abstractNum w:abstractNumId="48" w15:restartNumberingAfterBreak="0">
     <w:nsid w:val="4AA56BBA"/>
     <w:multiLevelType w:val="hybridMultilevel"/>
     <w:tmpl w:val="13A02B02"/>
@@ -19230,7 +21848,7 @@
       </w:pPr>
     </w:lvl>
   </w:abstractNum>
-  <w:abstractNum w:abstractNumId="44" w15:restartNumberingAfterBreak="0">
+  <w:abstractNum w:abstractNumId="49" w15:restartNumberingAfterBreak="0">
     <w:nsid w:val="504F34F1"/>
     <w:multiLevelType w:val="hybridMultilevel"/>
     <w:tmpl w:val="83CCC9EE"/>
@@ -19344,7 +21962,7 @@
       </w:rPr>
     </w:lvl>
   </w:abstractNum>
-  <w:abstractNum w:abstractNumId="45" w15:restartNumberingAfterBreak="0">
+  <w:abstractNum w:abstractNumId="50" w15:restartNumberingAfterBreak="0">
     <w:nsid w:val="50D11C80"/>
     <w:multiLevelType w:val="hybridMultilevel"/>
     <w:tmpl w:val="028AC8AE"/>
@@ -19458,7 +22076,7 @@
       </w:rPr>
     </w:lvl>
   </w:abstractNum>
-  <w:abstractNum w:abstractNumId="46" w15:restartNumberingAfterBreak="0">
+  <w:abstractNum w:abstractNumId="51" w15:restartNumberingAfterBreak="0">
     <w:nsid w:val="52F0103C"/>
     <w:multiLevelType w:val="hybridMultilevel"/>
     <w:tmpl w:val="CD643034"/>
@@ -19544,7 +22162,7 @@
       </w:pPr>
     </w:lvl>
   </w:abstractNum>
-  <w:abstractNum w:abstractNumId="47" w15:restartNumberingAfterBreak="0">
+  <w:abstractNum w:abstractNumId="52" w15:restartNumberingAfterBreak="0">
     <w:nsid w:val="542E3236"/>
     <w:multiLevelType w:val="hybridMultilevel"/>
     <w:tmpl w:val="85C6A410"/>
@@ -19630,7 +22248,7 @@
       </w:pPr>
     </w:lvl>
   </w:abstractNum>
-  <w:abstractNum w:abstractNumId="48" w15:restartNumberingAfterBreak="0">
+  <w:abstractNum w:abstractNumId="53" w15:restartNumberingAfterBreak="0">
     <w:nsid w:val="54434B05"/>
     <w:multiLevelType w:val="hybridMultilevel"/>
     <w:tmpl w:val="AE3CDAFE"/>
@@ -19716,7 +22334,7 @@
       </w:pPr>
     </w:lvl>
   </w:abstractNum>
-  <w:abstractNum w:abstractNumId="49" w15:restartNumberingAfterBreak="0">
+  <w:abstractNum w:abstractNumId="54" w15:restartNumberingAfterBreak="0">
     <w:nsid w:val="57B87501"/>
     <w:multiLevelType w:val="hybridMultilevel"/>
     <w:tmpl w:val="D9064046"/>
@@ -19830,7 +22448,7 @@
       </w:rPr>
     </w:lvl>
   </w:abstractNum>
-  <w:abstractNum w:abstractNumId="50" w15:restartNumberingAfterBreak="0">
+  <w:abstractNum w:abstractNumId="55" w15:restartNumberingAfterBreak="0">
     <w:nsid w:val="5C3E0E37"/>
     <w:multiLevelType w:val="hybridMultilevel"/>
     <w:tmpl w:val="493E34D6"/>
@@ -19919,7 +22537,7 @@
       </w:pPr>
     </w:lvl>
   </w:abstractNum>
-  <w:abstractNum w:abstractNumId="51" w15:restartNumberingAfterBreak="0">
+  <w:abstractNum w:abstractNumId="56" w15:restartNumberingAfterBreak="0">
     <w:nsid w:val="61490766"/>
     <w:multiLevelType w:val="hybridMultilevel"/>
     <w:tmpl w:val="1F28A244"/>
@@ -20005,7 +22623,96 @@
       </w:pPr>
     </w:lvl>
   </w:abstractNum>
-  <w:abstractNum w:abstractNumId="52" w15:restartNumberingAfterBreak="0">
+  <w:abstractNum w:abstractNumId="57" w15:restartNumberingAfterBreak="0">
+    <w:nsid w:val="6175114C"/>
+    <w:multiLevelType w:val="hybridMultilevel"/>
+    <w:tmpl w:val="E50A780E"/>
+    <w:lvl w:ilvl="0" w:tplc="FFFFFFFF">
+      <w:start w:val="1"/>
+      <w:numFmt w:val="decimal"/>
+      <w:lvlText w:val="%1."/>
+      <w:lvlJc w:val="left"/>
+      <w:pPr>
+        <w:ind w:left="720" w:hanging="360"/>
+      </w:pPr>
+      <w:rPr>
+        <w:rFonts w:hint="default"/>
+      </w:rPr>
+    </w:lvl>
+    <w:lvl w:ilvl="1" w:tplc="FFFFFFFF" w:tentative="1">
+      <w:start w:val="1"/>
+      <w:numFmt w:val="lowerLetter"/>
+      <w:lvlText w:val="%2."/>
+      <w:lvlJc w:val="left"/>
+      <w:pPr>
+        <w:ind w:left="1440" w:hanging="360"/>
+      </w:pPr>
+    </w:lvl>
+    <w:lvl w:ilvl="2" w:tplc="FFFFFFFF" w:tentative="1">
+      <w:start w:val="1"/>
+      <w:numFmt w:val="lowerRoman"/>
+      <w:lvlText w:val="%3."/>
+      <w:lvlJc w:val="right"/>
+      <w:pPr>
+        <w:ind w:left="2160" w:hanging="180"/>
+      </w:pPr>
+    </w:lvl>
+    <w:lvl w:ilvl="3" w:tplc="FFFFFFFF" w:tentative="1">
+      <w:start w:val="1"/>
+      <w:numFmt w:val="decimal"/>
+      <w:lvlText w:val="%4."/>
+      <w:lvlJc w:val="left"/>
+      <w:pPr>
+        <w:ind w:left="2880" w:hanging="360"/>
+      </w:pPr>
+    </w:lvl>
+    <w:lvl w:ilvl="4" w:tplc="FFFFFFFF" w:tentative="1">
+      <w:start w:val="1"/>
+      <w:numFmt w:val="lowerLetter"/>
+      <w:lvlText w:val="%5."/>
+      <w:lvlJc w:val="left"/>
+      <w:pPr>
+        <w:ind w:left="3600" w:hanging="360"/>
+      </w:pPr>
+    </w:lvl>
+    <w:lvl w:ilvl="5" w:tplc="FFFFFFFF" w:tentative="1">
+      <w:start w:val="1"/>
+      <w:numFmt w:val="lowerRoman"/>
+      <w:lvlText w:val="%6."/>
+      <w:lvlJc w:val="right"/>
+      <w:pPr>
+        <w:ind w:left="4320" w:hanging="180"/>
+      </w:pPr>
+    </w:lvl>
+    <w:lvl w:ilvl="6" w:tplc="FFFFFFFF" w:tentative="1">
+      <w:start w:val="1"/>
+      <w:numFmt w:val="decimal"/>
+      <w:lvlText w:val="%7."/>
+      <w:lvlJc w:val="left"/>
+      <w:pPr>
+        <w:ind w:left="5040" w:hanging="360"/>
+      </w:pPr>
+    </w:lvl>
+    <w:lvl w:ilvl="7" w:tplc="FFFFFFFF" w:tentative="1">
+      <w:start w:val="1"/>
+      <w:numFmt w:val="lowerLetter"/>
+      <w:lvlText w:val="%8."/>
+      <w:lvlJc w:val="left"/>
+      <w:pPr>
+        <w:ind w:left="5760" w:hanging="360"/>
+      </w:pPr>
+    </w:lvl>
+    <w:lvl w:ilvl="8" w:tplc="FFFFFFFF" w:tentative="1">
+      <w:start w:val="1"/>
+      <w:numFmt w:val="lowerRoman"/>
+      <w:lvlText w:val="%9."/>
+      <w:lvlJc w:val="right"/>
+      <w:pPr>
+        <w:ind w:left="6480" w:hanging="180"/>
+      </w:pPr>
+    </w:lvl>
+  </w:abstractNum>
+  <w:abstractNum w:abstractNumId="58" w15:restartNumberingAfterBreak="0">
     <w:nsid w:val="63050F7E"/>
     <w:multiLevelType w:val="hybridMultilevel"/>
     <w:tmpl w:val="07F80D9A"/>
@@ -20119,7 +22826,7 @@
       </w:rPr>
     </w:lvl>
   </w:abstractNum>
-  <w:abstractNum w:abstractNumId="53" w15:restartNumberingAfterBreak="0">
+  <w:abstractNum w:abstractNumId="59" w15:restartNumberingAfterBreak="0">
     <w:nsid w:val="67FA2E5D"/>
     <w:multiLevelType w:val="hybridMultilevel"/>
     <w:tmpl w:val="C9C63580"/>
@@ -20205,7 +22912,7 @@
       </w:pPr>
     </w:lvl>
   </w:abstractNum>
-  <w:abstractNum w:abstractNumId="54" w15:restartNumberingAfterBreak="0">
+  <w:abstractNum w:abstractNumId="60" w15:restartNumberingAfterBreak="0">
     <w:nsid w:val="68F97117"/>
     <w:multiLevelType w:val="hybridMultilevel"/>
     <w:tmpl w:val="F2BA5CE8"/>
@@ -20294,7 +23001,7 @@
       </w:pPr>
     </w:lvl>
   </w:abstractNum>
-  <w:abstractNum w:abstractNumId="55" w15:restartNumberingAfterBreak="0">
+  <w:abstractNum w:abstractNumId="61" w15:restartNumberingAfterBreak="0">
     <w:nsid w:val="695355A2"/>
     <w:multiLevelType w:val="hybridMultilevel"/>
     <w:tmpl w:val="398AC524"/>
@@ -20383,7 +23090,7 @@
       </w:pPr>
     </w:lvl>
   </w:abstractNum>
-  <w:abstractNum w:abstractNumId="56" w15:restartNumberingAfterBreak="0">
+  <w:abstractNum w:abstractNumId="62" w15:restartNumberingAfterBreak="0">
     <w:nsid w:val="6A550C28"/>
     <w:multiLevelType w:val="hybridMultilevel"/>
     <w:tmpl w:val="194499BC"/>
@@ -20472,7 +23179,7 @@
       </w:pPr>
     </w:lvl>
   </w:abstractNum>
-  <w:abstractNum w:abstractNumId="57" w15:restartNumberingAfterBreak="0">
+  <w:abstractNum w:abstractNumId="63" w15:restartNumberingAfterBreak="0">
     <w:nsid w:val="6B7B29D0"/>
     <w:multiLevelType w:val="multilevel"/>
     <w:tmpl w:val="140C0021"/>
@@ -20585,7 +23292,7 @@
       </w:rPr>
     </w:lvl>
   </w:abstractNum>
-  <w:abstractNum w:abstractNumId="58" w15:restartNumberingAfterBreak="0">
+  <w:abstractNum w:abstractNumId="64" w15:restartNumberingAfterBreak="0">
     <w:nsid w:val="6CDD35CC"/>
     <w:multiLevelType w:val="multilevel"/>
     <w:tmpl w:val="289EA6BA"/>
@@ -20734,7 +23441,7 @@
       </w:rPr>
     </w:lvl>
   </w:abstractNum>
-  <w:abstractNum w:abstractNumId="59" w15:restartNumberingAfterBreak="0">
+  <w:abstractNum w:abstractNumId="65" w15:restartNumberingAfterBreak="0">
     <w:nsid w:val="6D786BA4"/>
     <w:multiLevelType w:val="hybridMultilevel"/>
     <w:tmpl w:val="67E09366"/>
@@ -20820,7 +23527,7 @@
       </w:pPr>
     </w:lvl>
   </w:abstractNum>
-  <w:abstractNum w:abstractNumId="60" w15:restartNumberingAfterBreak="0">
+  <w:abstractNum w:abstractNumId="66" w15:restartNumberingAfterBreak="0">
     <w:nsid w:val="7BDC6BCF"/>
     <w:multiLevelType w:val="hybridMultilevel"/>
     <w:tmpl w:val="719CC940"/>
@@ -20934,7 +23641,7 @@
       </w:rPr>
     </w:lvl>
   </w:abstractNum>
-  <w:abstractNum w:abstractNumId="61" w15:restartNumberingAfterBreak="0">
+  <w:abstractNum w:abstractNumId="67" w15:restartNumberingAfterBreak="0">
     <w:nsid w:val="7C5D5599"/>
     <w:multiLevelType w:val="hybridMultilevel"/>
     <w:tmpl w:val="73DAD9F4"/>
@@ -21048,7 +23755,7 @@
       </w:rPr>
     </w:lvl>
   </w:abstractNum>
-  <w:abstractNum w:abstractNumId="62" w15:restartNumberingAfterBreak="0">
+  <w:abstractNum w:abstractNumId="68" w15:restartNumberingAfterBreak="0">
     <w:nsid w:val="7C7E4A23"/>
     <w:multiLevelType w:val="hybridMultilevel"/>
     <w:tmpl w:val="AB7C4478"/>
@@ -21162,7 +23869,7 @@
       </w:rPr>
     </w:lvl>
   </w:abstractNum>
-  <w:abstractNum w:abstractNumId="63" w15:restartNumberingAfterBreak="0">
+  <w:abstractNum w:abstractNumId="69" w15:restartNumberingAfterBreak="0">
     <w:nsid w:val="7D335EFE"/>
     <w:multiLevelType w:val="hybridMultilevel"/>
     <w:tmpl w:val="B006847A"/>
@@ -21251,7 +23958,7 @@
       </w:pPr>
     </w:lvl>
   </w:abstractNum>
-  <w:abstractNum w:abstractNumId="64" w15:restartNumberingAfterBreak="0">
+  <w:abstractNum w:abstractNumId="70" w15:restartNumberingAfterBreak="0">
     <w:nsid w:val="7DD65B8E"/>
     <w:multiLevelType w:val="hybridMultilevel"/>
     <w:tmpl w:val="65BEAD08"/>
@@ -21337,7 +24044,7 @@
       </w:pPr>
     </w:lvl>
   </w:abstractNum>
-  <w:abstractNum w:abstractNumId="65" w15:restartNumberingAfterBreak="0">
+  <w:abstractNum w:abstractNumId="71" w15:restartNumberingAfterBreak="0">
     <w:nsid w:val="7E2E7183"/>
     <w:multiLevelType w:val="hybridMultilevel"/>
     <w:tmpl w:val="924E3F70"/>
@@ -21423,7 +24130,7 @@
       </w:pPr>
     </w:lvl>
   </w:abstractNum>
-  <w:abstractNum w:abstractNumId="66" w15:restartNumberingAfterBreak="0">
+  <w:abstractNum w:abstractNumId="72" w15:restartNumberingAfterBreak="0">
     <w:nsid w:val="7E4040C4"/>
     <w:multiLevelType w:val="hybridMultilevel"/>
     <w:tmpl w:val="836C55AE"/>
@@ -21536,205 +24243,223 @@
     </w:lvl>
   </w:abstractNum>
   <w:num w:numId="1" w16cid:durableId="1906451046">
-    <w:abstractNumId w:val="40"/>
+    <w:abstractNumId w:val="44"/>
   </w:num>
   <w:num w:numId="2" w16cid:durableId="1453985449">
-    <w:abstractNumId w:val="58"/>
+    <w:abstractNumId w:val="64"/>
   </w:num>
   <w:num w:numId="3" w16cid:durableId="36273488">
-    <w:abstractNumId w:val="38"/>
+    <w:abstractNumId w:val="41"/>
   </w:num>
   <w:num w:numId="4" w16cid:durableId="1572812113">
-    <w:abstractNumId w:val="21"/>
+    <w:abstractNumId w:val="24"/>
   </w:num>
   <w:num w:numId="5" w16cid:durableId="504170421">
-    <w:abstractNumId w:val="51"/>
+    <w:abstractNumId w:val="56"/>
   </w:num>
   <w:num w:numId="6" w16cid:durableId="481893730">
-    <w:abstractNumId w:val="64"/>
+    <w:abstractNumId w:val="70"/>
   </w:num>
   <w:num w:numId="7" w16cid:durableId="367294735">
     <w:abstractNumId w:val="2"/>
   </w:num>
   <w:num w:numId="8" w16cid:durableId="260844878">
-    <w:abstractNumId w:val="63"/>
+    <w:abstractNumId w:val="69"/>
   </w:num>
   <w:num w:numId="9" w16cid:durableId="1997413304">
+    <w:abstractNumId w:val="20"/>
+  </w:num>
+  <w:num w:numId="10" w16cid:durableId="1005130703">
+    <w:abstractNumId w:val="32"/>
+  </w:num>
+  <w:num w:numId="11" w16cid:durableId="177085945">
+    <w:abstractNumId w:val="6"/>
+  </w:num>
+  <w:num w:numId="12" w16cid:durableId="1509637175">
+    <w:abstractNumId w:val="48"/>
+  </w:num>
+  <w:num w:numId="13" w16cid:durableId="357393380">
+    <w:abstractNumId w:val="67"/>
+  </w:num>
+  <w:num w:numId="14" w16cid:durableId="1952004256">
+    <w:abstractNumId w:val="71"/>
+  </w:num>
+  <w:num w:numId="15" w16cid:durableId="310597785">
+    <w:abstractNumId w:val="27"/>
+  </w:num>
+  <w:num w:numId="16" w16cid:durableId="1836147019">
+    <w:abstractNumId w:val="40"/>
+  </w:num>
+  <w:num w:numId="17" w16cid:durableId="26413900">
     <w:abstractNumId w:val="18"/>
   </w:num>
-  <w:num w:numId="10" w16cid:durableId="1005130703">
+  <w:num w:numId="18" w16cid:durableId="517668968">
     <w:abstractNumId w:val="29"/>
   </w:num>
-  <w:num w:numId="11" w16cid:durableId="177085945">
-    <w:abstractNumId w:val="5"/>
+  <w:num w:numId="19" w16cid:durableId="1880435928">
+    <w:abstractNumId w:val="13"/>
   </w:num>
-  <w:num w:numId="12" w16cid:durableId="1509637175">
-    <w:abstractNumId w:val="43"/>
+  <w:num w:numId="20" w16cid:durableId="289866063">
+    <w:abstractNumId w:val="58"/>
   </w:num>
-  <w:num w:numId="13" w16cid:durableId="357393380">
-    <w:abstractNumId w:val="61"/>
+  <w:num w:numId="21" w16cid:durableId="1376731278">
+    <w:abstractNumId w:val="49"/>
   </w:num>
-  <w:num w:numId="14" w16cid:durableId="1952004256">
+  <w:num w:numId="22" w16cid:durableId="611088510">
+    <w:abstractNumId w:val="72"/>
+  </w:num>
+  <w:num w:numId="23" w16cid:durableId="397938780">
+    <w:abstractNumId w:val="54"/>
+  </w:num>
+  <w:num w:numId="24" w16cid:durableId="59447173">
+    <w:abstractNumId w:val="68"/>
+  </w:num>
+  <w:num w:numId="25" w16cid:durableId="776364686">
+    <w:abstractNumId w:val="14"/>
+  </w:num>
+  <w:num w:numId="26" w16cid:durableId="1345938363">
+    <w:abstractNumId w:val="53"/>
+  </w:num>
+  <w:num w:numId="27" w16cid:durableId="1348362195">
     <w:abstractNumId w:val="65"/>
   </w:num>
-  <w:num w:numId="15" w16cid:durableId="310597785">
-    <w:abstractNumId w:val="24"/>
+  <w:num w:numId="28" w16cid:durableId="1617760246">
+    <w:abstractNumId w:val="11"/>
   </w:num>
-  <w:num w:numId="16" w16cid:durableId="1836147019">
+  <w:num w:numId="29" w16cid:durableId="1735665909">
     <w:abstractNumId w:val="37"/>
   </w:num>
-  <w:num w:numId="17" w16cid:durableId="26413900">
-    <w:abstractNumId w:val="16"/>
-  </w:num>
-  <w:num w:numId="18" w16cid:durableId="517668968">
-    <w:abstractNumId w:val="26"/>
-  </w:num>
-  <w:num w:numId="19" w16cid:durableId="1880435928">
-    <w:abstractNumId w:val="12"/>
-  </w:num>
-  <w:num w:numId="20" w16cid:durableId="289866063">
-    <w:abstractNumId w:val="52"/>
-  </w:num>
-  <w:num w:numId="21" w16cid:durableId="1376731278">
-    <w:abstractNumId w:val="44"/>
-  </w:num>
-  <w:num w:numId="22" w16cid:durableId="611088510">
-    <w:abstractNumId w:val="66"/>
-  </w:num>
-  <w:num w:numId="23" w16cid:durableId="397938780">
-    <w:abstractNumId w:val="49"/>
-  </w:num>
-  <w:num w:numId="24" w16cid:durableId="59447173">
-    <w:abstractNumId w:val="62"/>
-  </w:num>
-  <w:num w:numId="25" w16cid:durableId="776364686">
-    <w:abstractNumId w:val="13"/>
-  </w:num>
-  <w:num w:numId="26" w16cid:durableId="1345938363">
-    <w:abstractNumId w:val="48"/>
-  </w:num>
-  <w:num w:numId="27" w16cid:durableId="1348362195">
-    <w:abstractNumId w:val="59"/>
-  </w:num>
-  <w:num w:numId="28" w16cid:durableId="1617760246">
-    <w:abstractNumId w:val="10"/>
-  </w:num>
-  <w:num w:numId="29" w16cid:durableId="1735665909">
-    <w:abstractNumId w:val="34"/>
-  </w:num>
   <w:num w:numId="30" w16cid:durableId="265311950">
-    <w:abstractNumId w:val="46"/>
+    <w:abstractNumId w:val="51"/>
   </w:num>
   <w:num w:numId="31" w16cid:durableId="951473542">
     <w:abstractNumId w:val="0"/>
   </w:num>
   <w:num w:numId="32" w16cid:durableId="2054425664">
-    <w:abstractNumId w:val="27"/>
+    <w:abstractNumId w:val="30"/>
   </w:num>
   <w:num w:numId="33" w16cid:durableId="1063866069">
-    <w:abstractNumId w:val="14"/>
+    <w:abstractNumId w:val="15"/>
   </w:num>
   <w:num w:numId="34" w16cid:durableId="406416991">
-    <w:abstractNumId w:val="3"/>
+    <w:abstractNumId w:val="4"/>
   </w:num>
   <w:num w:numId="35" w16cid:durableId="1134299897">
-    <w:abstractNumId w:val="50"/>
+    <w:abstractNumId w:val="55"/>
   </w:num>
   <w:num w:numId="36" w16cid:durableId="47841733">
-    <w:abstractNumId w:val="6"/>
+    <w:abstractNumId w:val="7"/>
   </w:num>
   <w:num w:numId="37" w16cid:durableId="2069104837">
-    <w:abstractNumId w:val="47"/>
+    <w:abstractNumId w:val="52"/>
   </w:num>
   <w:num w:numId="38" w16cid:durableId="1416635875">
-    <w:abstractNumId w:val="53"/>
+    <w:abstractNumId w:val="59"/>
   </w:num>
   <w:num w:numId="39" w16cid:durableId="2053847489">
-    <w:abstractNumId w:val="30"/>
+    <w:abstractNumId w:val="33"/>
   </w:num>
   <w:num w:numId="40" w16cid:durableId="2123986167">
-    <w:abstractNumId w:val="54"/>
+    <w:abstractNumId w:val="60"/>
   </w:num>
   <w:num w:numId="41" w16cid:durableId="404186285">
-    <w:abstractNumId w:val="56"/>
+    <w:abstractNumId w:val="62"/>
   </w:num>
   <w:num w:numId="42" w16cid:durableId="1117135936">
     <w:abstractNumId w:val="1"/>
   </w:num>
   <w:num w:numId="43" w16cid:durableId="671567673">
+    <w:abstractNumId w:val="21"/>
+  </w:num>
+  <w:num w:numId="44" w16cid:durableId="1489634269">
+    <w:abstractNumId w:val="31"/>
+  </w:num>
+  <w:num w:numId="45" w16cid:durableId="696585966">
+    <w:abstractNumId w:val="23"/>
+  </w:num>
+  <w:num w:numId="46" w16cid:durableId="1356148778">
+    <w:abstractNumId w:val="12"/>
+  </w:num>
+  <w:num w:numId="47" w16cid:durableId="1696729042">
+    <w:abstractNumId w:val="26"/>
+  </w:num>
+  <w:num w:numId="48" w16cid:durableId="1643582493">
+    <w:abstractNumId w:val="38"/>
+  </w:num>
+  <w:num w:numId="49" w16cid:durableId="504824091">
+    <w:abstractNumId w:val="25"/>
+  </w:num>
+  <w:num w:numId="50" w16cid:durableId="229310739">
+    <w:abstractNumId w:val="47"/>
+  </w:num>
+  <w:num w:numId="51" w16cid:durableId="1563833298">
+    <w:abstractNumId w:val="36"/>
+  </w:num>
+  <w:num w:numId="52" w16cid:durableId="823664644">
+    <w:abstractNumId w:val="5"/>
+  </w:num>
+  <w:num w:numId="53" w16cid:durableId="923612367">
+    <w:abstractNumId w:val="35"/>
+  </w:num>
+  <w:num w:numId="54" w16cid:durableId="1259022329">
+    <w:abstractNumId w:val="28"/>
+  </w:num>
+  <w:num w:numId="55" w16cid:durableId="554123610">
+    <w:abstractNumId w:val="43"/>
+  </w:num>
+  <w:num w:numId="56" w16cid:durableId="718633574">
     <w:abstractNumId w:val="19"/>
   </w:num>
-  <w:num w:numId="44" w16cid:durableId="1489634269">
-    <w:abstractNumId w:val="28"/>
+  <w:num w:numId="57" w16cid:durableId="25957547">
+    <w:abstractNumId w:val="61"/>
   </w:num>
-  <w:num w:numId="45" w16cid:durableId="696585966">
-    <w:abstractNumId w:val="20"/>
+  <w:num w:numId="58" w16cid:durableId="1122653648">
+    <w:abstractNumId w:val="34"/>
   </w:num>
-  <w:num w:numId="46" w16cid:durableId="1356148778">
-    <w:abstractNumId w:val="11"/>
+  <w:num w:numId="59" w16cid:durableId="475755335">
+    <w:abstractNumId w:val="46"/>
   </w:num>
-  <w:num w:numId="47" w16cid:durableId="1696729042">
-    <w:abstractNumId w:val="23"/>
+  <w:num w:numId="60" w16cid:durableId="912617503">
+    <w:abstractNumId w:val="17"/>
   </w:num>
-  <w:num w:numId="48" w16cid:durableId="1643582493">
-    <w:abstractNumId w:val="35"/>
+  <w:num w:numId="61" w16cid:durableId="33623412">
+    <w:abstractNumId w:val="39"/>
   </w:num>
-  <w:num w:numId="49" w16cid:durableId="504824091">
-    <w:abstractNumId w:val="22"/>
+  <w:num w:numId="62" w16cid:durableId="1123108680">
+    <w:abstractNumId w:val="63"/>
   </w:num>
-  <w:num w:numId="50" w16cid:durableId="229310739">
+  <w:num w:numId="63" w16cid:durableId="679626369">
+    <w:abstractNumId w:val="66"/>
+  </w:num>
+  <w:num w:numId="64" w16cid:durableId="467092172">
+    <w:abstractNumId w:val="50"/>
+  </w:num>
+  <w:num w:numId="65" w16cid:durableId="31925113">
+    <w:abstractNumId w:val="9"/>
+  </w:num>
+  <w:num w:numId="66" w16cid:durableId="406148779">
+    <w:abstractNumId w:val="10"/>
+  </w:num>
+  <w:num w:numId="67" w16cid:durableId="2242113">
+    <w:abstractNumId w:val="8"/>
+  </w:num>
+  <w:num w:numId="68" w16cid:durableId="1696468588">
+    <w:abstractNumId w:val="3"/>
+  </w:num>
+  <w:num w:numId="69" w16cid:durableId="1262420840">
+    <w:abstractNumId w:val="57"/>
+  </w:num>
+  <w:num w:numId="70" w16cid:durableId="2015574194">
+    <w:abstractNumId w:val="45"/>
+  </w:num>
+  <w:num w:numId="71" w16cid:durableId="377584308">
+    <w:abstractNumId w:val="16"/>
+  </w:num>
+  <w:num w:numId="72" w16cid:durableId="1450009072">
     <w:abstractNumId w:val="42"/>
   </w:num>
-  <w:num w:numId="51" w16cid:durableId="1563833298">
-    <w:abstractNumId w:val="33"/>
-  </w:num>
-  <w:num w:numId="52" w16cid:durableId="823664644">
-    <w:abstractNumId w:val="4"/>
-  </w:num>
-  <w:num w:numId="53" w16cid:durableId="923612367">
-    <w:abstractNumId w:val="32"/>
-  </w:num>
-  <w:num w:numId="54" w16cid:durableId="1259022329">
-    <w:abstractNumId w:val="25"/>
-  </w:num>
-  <w:num w:numId="55" w16cid:durableId="554123610">
-    <w:abstractNumId w:val="39"/>
-  </w:num>
-  <w:num w:numId="56" w16cid:durableId="718633574">
-    <w:abstractNumId w:val="17"/>
-  </w:num>
-  <w:num w:numId="57" w16cid:durableId="25957547">
-    <w:abstractNumId w:val="55"/>
-  </w:num>
-  <w:num w:numId="58" w16cid:durableId="1122653648">
-    <w:abstractNumId w:val="31"/>
-  </w:num>
-  <w:num w:numId="59" w16cid:durableId="475755335">
-    <w:abstractNumId w:val="41"/>
-  </w:num>
-  <w:num w:numId="60" w16cid:durableId="912617503">
-    <w:abstractNumId w:val="15"/>
-  </w:num>
-  <w:num w:numId="61" w16cid:durableId="33623412">
-    <w:abstractNumId w:val="36"/>
-  </w:num>
-  <w:num w:numId="62" w16cid:durableId="1123108680">
-    <w:abstractNumId w:val="57"/>
-  </w:num>
-  <w:num w:numId="63" w16cid:durableId="679626369">
-    <w:abstractNumId w:val="60"/>
-  </w:num>
-  <w:num w:numId="64" w16cid:durableId="467092172">
-    <w:abstractNumId w:val="45"/>
-  </w:num>
-  <w:num w:numId="65" w16cid:durableId="31925113">
-    <w:abstractNumId w:val="8"/>
-  </w:num>
-  <w:num w:numId="66" w16cid:durableId="406148779">
-    <w:abstractNumId w:val="9"/>
-  </w:num>
-  <w:num w:numId="67" w16cid:durableId="2242113">
-    <w:abstractNumId w:val="7"/>
+  <w:num w:numId="73" w16cid:durableId="1805779366">
+    <w:abstractNumId w:val="22"/>
   </w:num>
 </w:numbering>
 </file>

</xml_diff>